<commit_message>
Class Diagram e Mockup
</commit_message>
<xml_diff>
--- a/Deliverables/Edil CommerceDesign_RAD.docx
+++ b/Deliverables/Edil CommerceDesign_RAD.docx
@@ -111,6 +111,7 @@
           <w:lang w:val="en-GB"/>
         </w:rPr>
       </w:pPr>
+      <w:proofErr w:type="spellStart"/>
       <w:r>
         <w:rPr>
           <w:rFonts w:ascii="Arial" w:hAnsi="Arial"/>
@@ -118,8 +119,9 @@
           <w:sz w:val="36"/>
           <w:lang w:val="en-GB"/>
         </w:rPr>
-        <w:t>Edil CommerceDesign</w:t>
+        <w:t>Edil</w:t>
       </w:r>
+      <w:proofErr w:type="spellEnd"/>
       <w:r>
         <w:rPr>
           <w:rFonts w:ascii="Arial" w:hAnsi="Arial"/>
@@ -127,8 +129,9 @@
           <w:sz w:val="36"/>
           <w:lang w:val="en-GB"/>
         </w:rPr>
-        <w:br/>
+        <w:t xml:space="preserve"> </w:t>
       </w:r>
+      <w:proofErr w:type="spellStart"/>
       <w:r>
         <w:rPr>
           <w:rFonts w:ascii="Arial" w:hAnsi="Arial"/>
@@ -136,8 +139,9 @@
           <w:sz w:val="36"/>
           <w:lang w:val="en-GB"/>
         </w:rPr>
-        <w:t>Requirements Analysis Document</w:t>
+        <w:t>CommerceDesign</w:t>
       </w:r>
+      <w:proofErr w:type="spellEnd"/>
       <w:r>
         <w:rPr>
           <w:rFonts w:ascii="Arial" w:hAnsi="Arial"/>
@@ -146,7 +150,44 @@
           <w:lang w:val="en-GB"/>
         </w:rPr>
         <w:br/>
-        <w:t>Versione 1.0</w:t>
+      </w:r>
+      <w:r>
+        <w:rPr>
+          <w:rFonts w:ascii="Arial" w:hAnsi="Arial"/>
+          <w:b/>
+          <w:sz w:val="36"/>
+          <w:lang w:val="en-GB"/>
+        </w:rPr>
+        <w:t>Requirements Analysis Document</w:t>
+      </w:r>
+      <w:r>
+        <w:rPr>
+          <w:rFonts w:ascii="Arial" w:hAnsi="Arial"/>
+          <w:b/>
+          <w:sz w:val="36"/>
+          <w:lang w:val="en-GB"/>
+        </w:rPr>
+        <w:br/>
+      </w:r>
+      <w:proofErr w:type="spellStart"/>
+      <w:r>
+        <w:rPr>
+          <w:rFonts w:ascii="Arial" w:hAnsi="Arial"/>
+          <w:b/>
+          <w:sz w:val="36"/>
+          <w:lang w:val="en-GB"/>
+        </w:rPr>
+        <w:t>Versione</w:t>
+      </w:r>
+      <w:proofErr w:type="spellEnd"/>
+      <w:r>
+        <w:rPr>
+          <w:rFonts w:ascii="Arial" w:hAnsi="Arial"/>
+          <w:b/>
+          <w:sz w:val="36"/>
+          <w:lang w:val="en-GB"/>
+        </w:rPr>
+        <w:t xml:space="preserve"> 1.0</w:t>
       </w:r>
       <w:r>
         <w:rPr>
@@ -525,6 +566,15 @@
     </w:p>
     <w:sdt>
       <w:sdtPr>
+        <w:rPr>
+          <w:rFonts w:ascii="Times New Roman" w:eastAsia="Lucida Sans Unicode" w:hAnsi="Times New Roman" w:cs="Times New Roman"/>
+          <w:color w:val="0563C1" w:themeColor="hyperlink"/>
+          <w:kern w:val="1"/>
+          <w:sz w:val="24"/>
+          <w:szCs w:val="24"/>
+          <w:u w:val="single"/>
+          <w:lang w:eastAsia="en-US"/>
+        </w:rPr>
         <w:id w:val="-1023785649"/>
         <w:docPartObj>
           <w:docPartGallery w:val="Table of Contents"/>
@@ -533,14 +583,10 @@
       </w:sdtPr>
       <w:sdtEndPr>
         <w:rPr>
-          <w:rFonts w:ascii="Times New Roman" w:eastAsia="Lucida Sans Unicode" w:hAnsi="Times New Roman" w:cs="Times New Roman"/>
           <w:b/>
           <w:bCs/>
           <w:color w:val="auto"/>
-          <w:kern w:val="1"/>
-          <w:sz w:val="24"/>
-          <w:szCs w:val="24"/>
-          <w:lang w:eastAsia="en-US"/>
+          <w:u w:val="none"/>
         </w:rPr>
       </w:sdtEndPr>
       <w:sdtContent>
@@ -576,7 +622,7 @@
           <w:r>
             <w:fldChar w:fldCharType="separate"/>
           </w:r>
-          <w:hyperlink w:anchor="_Toc118823058" w:history="1">
+          <w:hyperlink w:anchor="_Toc118879515" w:history="1">
             <w:r>
               <w:rPr>
                 <w:rStyle w:val="Collegamentoipertestuale"/>
@@ -605,7 +651,7 @@
                 <w:noProof/>
                 <w:webHidden/>
               </w:rPr>
-              <w:instrText xml:space="preserve"> PAGEREF _Toc118823058 \h </w:instrText>
+              <w:instrText xml:space="preserve"> PAGEREF _Toc118879515 \h </w:instrText>
             </w:r>
             <w:r>
               <w:rPr>
@@ -652,7 +698,7 @@
               <w:lang w:eastAsia="it-IT"/>
             </w:rPr>
           </w:pPr>
-          <w:hyperlink w:anchor="_Toc118823059" w:history="1">
+          <w:hyperlink w:anchor="_Toc118879516" w:history="1">
             <w:r>
               <w:rPr>
                 <w:rStyle w:val="Collegamentoipertestuale"/>
@@ -701,7 +747,7 @@
                 <w:noProof/>
                 <w:webHidden/>
               </w:rPr>
-              <w:instrText xml:space="preserve"> PAGEREF _Toc118823059 \h </w:instrText>
+              <w:instrText xml:space="preserve"> PAGEREF _Toc118879516 \h </w:instrText>
             </w:r>
             <w:r>
               <w:rPr>
@@ -747,7 +793,7 @@
               <w:lang w:eastAsia="it-IT"/>
             </w:rPr>
           </w:pPr>
-          <w:hyperlink w:anchor="_Toc118823060" w:history="1">
+          <w:hyperlink w:anchor="_Toc118879517" w:history="1">
             <w:r>
               <w:rPr>
                 <w:rStyle w:val="Collegamentoipertestuale"/>
@@ -777,7 +823,7 @@
                 <w:noProof/>
                 <w:webHidden/>
               </w:rPr>
-              <w:instrText xml:space="preserve"> PAGEREF _Toc118823060 \h </w:instrText>
+              <w:instrText xml:space="preserve"> PAGEREF _Toc118879517 \h </w:instrText>
             </w:r>
             <w:r>
               <w:rPr>
@@ -823,7 +869,7 @@
               <w:lang w:eastAsia="it-IT"/>
             </w:rPr>
           </w:pPr>
-          <w:hyperlink w:anchor="_Toc118823061" w:history="1">
+          <w:hyperlink w:anchor="_Toc118879518" w:history="1">
             <w:r>
               <w:rPr>
                 <w:rStyle w:val="Collegamentoipertestuale"/>
@@ -852,7 +898,7 @@
                 <w:noProof/>
                 <w:webHidden/>
               </w:rPr>
-              <w:instrText xml:space="preserve"> PAGEREF _Toc118823061 \h </w:instrText>
+              <w:instrText xml:space="preserve"> PAGEREF _Toc118879518 \h </w:instrText>
             </w:r>
             <w:r>
               <w:rPr>
@@ -898,7 +944,7 @@
               <w:lang w:eastAsia="it-IT"/>
             </w:rPr>
           </w:pPr>
-          <w:hyperlink w:anchor="_Toc118823062" w:history="1">
+          <w:hyperlink w:anchor="_Toc118879519" w:history="1">
             <w:r>
               <w:rPr>
                 <w:rStyle w:val="Collegamentoipertestuale"/>
@@ -927,7 +973,7 @@
                 <w:noProof/>
                 <w:webHidden/>
               </w:rPr>
-              <w:instrText xml:space="preserve"> PAGEREF _Toc118823062 \h </w:instrText>
+              <w:instrText xml:space="preserve"> PAGEREF _Toc118879519 \h </w:instrText>
             </w:r>
             <w:r>
               <w:rPr>
@@ -973,7 +1019,7 @@
               <w:lang w:eastAsia="it-IT"/>
             </w:rPr>
           </w:pPr>
-          <w:hyperlink w:anchor="_Toc118823063" w:history="1">
+          <w:hyperlink w:anchor="_Toc118879520" w:history="1">
             <w:r>
               <w:rPr>
                 <w:rStyle w:val="Collegamentoipertestuale"/>
@@ -1003,7 +1049,7 @@
                 <w:noProof/>
                 <w:webHidden/>
               </w:rPr>
-              <w:instrText xml:space="preserve"> PAGEREF _Toc118823063 \h </w:instrText>
+              <w:instrText xml:space="preserve"> PAGEREF _Toc118879520 \h </w:instrText>
             </w:r>
             <w:r>
               <w:rPr>
@@ -1049,7 +1095,7 @@
               <w:lang w:eastAsia="it-IT"/>
             </w:rPr>
           </w:pPr>
-          <w:hyperlink w:anchor="_Toc118823064" w:history="1">
+          <w:hyperlink w:anchor="_Toc118879521" w:history="1">
             <w:r>
               <w:rPr>
                 <w:rStyle w:val="Collegamentoipertestuale"/>
@@ -1079,7 +1125,7 @@
                 <w:noProof/>
                 <w:webHidden/>
               </w:rPr>
-              <w:instrText xml:space="preserve"> PAGEREF _Toc118823064 \h </w:instrText>
+              <w:instrText xml:space="preserve"> PAGEREF _Toc118879521 \h </w:instrText>
             </w:r>
             <w:r>
               <w:rPr>
@@ -1125,7 +1171,7 @@
               <w:lang w:eastAsia="it-IT"/>
             </w:rPr>
           </w:pPr>
-          <w:hyperlink w:anchor="_Toc118823065" w:history="1">
+          <w:hyperlink w:anchor="_Toc118879522" w:history="1">
             <w:r>
               <w:rPr>
                 <w:rStyle w:val="Collegamentoipertestuale"/>
@@ -1153,7 +1199,7 @@
                 <w:noProof/>
                 <w:webHidden/>
               </w:rPr>
-              <w:instrText xml:space="preserve"> PAGEREF _Toc118823065 \h </w:instrText>
+              <w:instrText xml:space="preserve"> PAGEREF _Toc118879522 \h </w:instrText>
             </w:r>
             <w:r>
               <w:rPr>
@@ -1199,7 +1245,7 @@
               <w:lang w:eastAsia="it-IT"/>
             </w:rPr>
           </w:pPr>
-          <w:hyperlink w:anchor="_Toc118823066" w:history="1">
+          <w:hyperlink w:anchor="_Toc118879523" w:history="1">
             <w:r>
               <w:rPr>
                 <w:rStyle w:val="Collegamentoipertestuale"/>
@@ -1228,7 +1274,7 @@
                 <w:noProof/>
                 <w:webHidden/>
               </w:rPr>
-              <w:instrText xml:space="preserve"> PAGEREF _Toc118823066 \h </w:instrText>
+              <w:instrText xml:space="preserve"> PAGEREF _Toc118879523 \h </w:instrText>
             </w:r>
             <w:r>
               <w:rPr>
@@ -1274,7 +1320,7 @@
               <w:lang w:eastAsia="it-IT"/>
             </w:rPr>
           </w:pPr>
-          <w:hyperlink w:anchor="_Toc118823067" w:history="1">
+          <w:hyperlink w:anchor="_Toc118879524" w:history="1">
             <w:r>
               <w:rPr>
                 <w:rStyle w:val="Collegamentoipertestuale"/>
@@ -1303,7 +1349,7 @@
                 <w:noProof/>
                 <w:webHidden/>
               </w:rPr>
-              <w:instrText xml:space="preserve"> PAGEREF _Toc118823067 \h </w:instrText>
+              <w:instrText xml:space="preserve"> PAGEREF _Toc118879524 \h </w:instrText>
             </w:r>
             <w:r>
               <w:rPr>
@@ -1349,7 +1395,7 @@
               <w:lang w:eastAsia="it-IT"/>
             </w:rPr>
           </w:pPr>
-          <w:hyperlink w:anchor="_Toc118823068" w:history="1">
+          <w:hyperlink w:anchor="_Toc118879525" w:history="1">
             <w:r>
               <w:rPr>
                 <w:rStyle w:val="Collegamentoipertestuale"/>
@@ -1377,7 +1423,7 @@
                 <w:noProof/>
                 <w:webHidden/>
               </w:rPr>
-              <w:instrText xml:space="preserve"> PAGEREF _Toc118823068 \h </w:instrText>
+              <w:instrText xml:space="preserve"> PAGEREF _Toc118879525 \h </w:instrText>
             </w:r>
             <w:r>
               <w:rPr>
@@ -1423,7 +1469,7 @@
               <w:lang w:eastAsia="it-IT"/>
             </w:rPr>
           </w:pPr>
-          <w:hyperlink w:anchor="_Toc118823069" w:history="1">
+          <w:hyperlink w:anchor="_Toc118879526" w:history="1">
             <w:r>
               <w:rPr>
                 <w:rStyle w:val="Collegamentoipertestuale"/>
@@ -1452,7 +1498,7 @@
                 <w:noProof/>
                 <w:webHidden/>
               </w:rPr>
-              <w:instrText xml:space="preserve"> PAGEREF _Toc118823069 \h </w:instrText>
+              <w:instrText xml:space="preserve"> PAGEREF _Toc118879526 \h </w:instrText>
             </w:r>
             <w:r>
               <w:rPr>
@@ -1498,7 +1544,7 @@
               <w:lang w:eastAsia="it-IT"/>
             </w:rPr>
           </w:pPr>
-          <w:hyperlink w:anchor="_Toc118823070" w:history="1">
+          <w:hyperlink w:anchor="_Toc118879527" w:history="1">
             <w:r>
               <w:rPr>
                 <w:rStyle w:val="Collegamentoipertestuale"/>
@@ -1527,7 +1573,7 @@
                 <w:noProof/>
                 <w:webHidden/>
               </w:rPr>
-              <w:instrText xml:space="preserve"> PAGEREF _Toc118823070 \h </w:instrText>
+              <w:instrText xml:space="preserve"> PAGEREF _Toc118879527 \h </w:instrText>
             </w:r>
             <w:r>
               <w:rPr>
@@ -1573,7 +1619,7 @@
               <w:lang w:eastAsia="it-IT"/>
             </w:rPr>
           </w:pPr>
-          <w:hyperlink w:anchor="_Toc118823071" w:history="1">
+          <w:hyperlink w:anchor="_Toc118879528" w:history="1">
             <w:r>
               <w:rPr>
                 <w:rStyle w:val="Collegamentoipertestuale"/>
@@ -1601,7 +1647,7 @@
                 <w:noProof/>
                 <w:webHidden/>
               </w:rPr>
-              <w:instrText xml:space="preserve"> PAGEREF _Toc118823071 \h </w:instrText>
+              <w:instrText xml:space="preserve"> PAGEREF _Toc118879528 \h </w:instrText>
             </w:r>
             <w:r>
               <w:rPr>
@@ -1647,7 +1693,7 @@
               <w:lang w:eastAsia="it-IT"/>
             </w:rPr>
           </w:pPr>
-          <w:hyperlink w:anchor="_Toc118823072" w:history="1">
+          <w:hyperlink w:anchor="_Toc118879529" w:history="1">
             <w:r>
               <w:rPr>
                 <w:rStyle w:val="Collegamentoipertestuale"/>
@@ -1676,7 +1722,7 @@
                 <w:noProof/>
                 <w:webHidden/>
               </w:rPr>
-              <w:instrText xml:space="preserve"> PAGEREF _Toc118823072 \h </w:instrText>
+              <w:instrText xml:space="preserve"> PAGEREF _Toc118879529 \h </w:instrText>
             </w:r>
             <w:r>
               <w:rPr>
@@ -1722,7 +1768,7 @@
               <w:lang w:eastAsia="it-IT"/>
             </w:rPr>
           </w:pPr>
-          <w:hyperlink w:anchor="_Toc118823073" w:history="1">
+          <w:hyperlink w:anchor="_Toc118879530" w:history="1">
             <w:r>
               <w:rPr>
                 <w:rStyle w:val="Collegamentoipertestuale"/>
@@ -1751,7 +1797,7 @@
                 <w:noProof/>
                 <w:webHidden/>
               </w:rPr>
-              <w:instrText xml:space="preserve"> PAGEREF _Toc118823073 \h </w:instrText>
+              <w:instrText xml:space="preserve"> PAGEREF _Toc118879530 \h </w:instrText>
             </w:r>
             <w:r>
               <w:rPr>
@@ -1797,7 +1843,7 @@
               <w:lang w:eastAsia="it-IT"/>
             </w:rPr>
           </w:pPr>
-          <w:hyperlink w:anchor="_Toc118823074" w:history="1">
+          <w:hyperlink w:anchor="_Toc118879531" w:history="1">
             <w:r>
               <w:rPr>
                 <w:rStyle w:val="Collegamentoipertestuale"/>
@@ -1826,7 +1872,7 @@
                 <w:noProof/>
                 <w:webHidden/>
               </w:rPr>
-              <w:instrText xml:space="preserve"> PAGEREF _Toc118823074 \h </w:instrText>
+              <w:instrText xml:space="preserve"> PAGEREF _Toc118879531 \h </w:instrText>
             </w:r>
             <w:r>
               <w:rPr>
@@ -1872,7 +1918,7 @@
               <w:lang w:eastAsia="it-IT"/>
             </w:rPr>
           </w:pPr>
-          <w:hyperlink w:anchor="_Toc118823075" w:history="1">
+          <w:hyperlink w:anchor="_Toc118879532" w:history="1">
             <w:r>
               <w:rPr>
                 <w:rStyle w:val="Collegamentoipertestuale"/>
@@ -1900,7 +1946,7 @@
                 <w:noProof/>
                 <w:webHidden/>
               </w:rPr>
-              <w:instrText xml:space="preserve"> PAGEREF _Toc118823075 \h </w:instrText>
+              <w:instrText xml:space="preserve"> PAGEREF _Toc118879532 \h </w:instrText>
             </w:r>
             <w:r>
               <w:rPr>
@@ -1946,7 +1992,7 @@
               <w:lang w:eastAsia="it-IT"/>
             </w:rPr>
           </w:pPr>
-          <w:hyperlink w:anchor="_Toc118823076" w:history="1">
+          <w:hyperlink w:anchor="_Toc118879533" w:history="1">
             <w:r>
               <w:rPr>
                 <w:rStyle w:val="Collegamentoipertestuale"/>
@@ -1975,7 +2021,7 @@
                 <w:noProof/>
                 <w:webHidden/>
               </w:rPr>
-              <w:instrText xml:space="preserve"> PAGEREF _Toc118823076 \h </w:instrText>
+              <w:instrText xml:space="preserve"> PAGEREF _Toc118879533 \h </w:instrText>
             </w:r>
             <w:r>
               <w:rPr>
@@ -2021,7 +2067,7 @@
               <w:lang w:eastAsia="it-IT"/>
             </w:rPr>
           </w:pPr>
-          <w:hyperlink w:anchor="_Toc118823077" w:history="1">
+          <w:hyperlink w:anchor="_Toc118879534" w:history="1">
             <w:r>
               <w:rPr>
                 <w:rStyle w:val="Collegamentoipertestuale"/>
@@ -2050,7 +2096,7 @@
                 <w:noProof/>
                 <w:webHidden/>
               </w:rPr>
-              <w:instrText xml:space="preserve"> PAGEREF _Toc118823077 \h </w:instrText>
+              <w:instrText xml:space="preserve"> PAGEREF _Toc118879534 \h </w:instrText>
             </w:r>
             <w:r>
               <w:rPr>
@@ -2096,7 +2142,7 @@
               <w:lang w:eastAsia="it-IT"/>
             </w:rPr>
           </w:pPr>
-          <w:hyperlink w:anchor="_Toc118823078" w:history="1">
+          <w:hyperlink w:anchor="_Toc118879535" w:history="1">
             <w:r>
               <w:rPr>
                 <w:rStyle w:val="Collegamentoipertestuale"/>
@@ -2125,7 +2171,7 @@
                 <w:noProof/>
                 <w:webHidden/>
               </w:rPr>
-              <w:instrText xml:space="preserve"> PAGEREF _Toc118823078 \h </w:instrText>
+              <w:instrText xml:space="preserve"> PAGEREF _Toc118879535 \h </w:instrText>
             </w:r>
             <w:r>
               <w:rPr>
@@ -2171,7 +2217,7 @@
               <w:lang w:eastAsia="it-IT"/>
             </w:rPr>
           </w:pPr>
-          <w:hyperlink w:anchor="_Toc118823079" w:history="1">
+          <w:hyperlink w:anchor="_Toc118879536" w:history="1">
             <w:r>
               <w:rPr>
                 <w:rStyle w:val="Collegamentoipertestuale"/>
@@ -2199,7 +2245,7 @@
                 <w:noProof/>
                 <w:webHidden/>
               </w:rPr>
-              <w:instrText xml:space="preserve"> PAGEREF _Toc118823079 \h </w:instrText>
+              <w:instrText xml:space="preserve"> PAGEREF _Toc118879536 \h </w:instrText>
             </w:r>
             <w:r>
               <w:rPr>
@@ -2245,7 +2291,7 @@
               <w:lang w:eastAsia="it-IT"/>
             </w:rPr>
           </w:pPr>
-          <w:hyperlink w:anchor="_Toc118823080" w:history="1">
+          <w:hyperlink w:anchor="_Toc118879537" w:history="1">
             <w:r>
               <w:rPr>
                 <w:rStyle w:val="Collegamentoipertestuale"/>
@@ -2274,7 +2320,7 @@
                 <w:noProof/>
                 <w:webHidden/>
               </w:rPr>
-              <w:instrText xml:space="preserve"> PAGEREF _Toc118823080 \h </w:instrText>
+              <w:instrText xml:space="preserve"> PAGEREF _Toc118879537 \h </w:instrText>
             </w:r>
             <w:r>
               <w:rPr>
@@ -2320,7 +2366,7 @@
               <w:lang w:eastAsia="it-IT"/>
             </w:rPr>
           </w:pPr>
-          <w:hyperlink w:anchor="_Toc118823081" w:history="1">
+          <w:hyperlink w:anchor="_Toc118879538" w:history="1">
             <w:r>
               <w:rPr>
                 <w:rStyle w:val="Collegamentoipertestuale"/>
@@ -2349,7 +2395,7 @@
                 <w:noProof/>
                 <w:webHidden/>
               </w:rPr>
-              <w:instrText xml:space="preserve"> PAGEREF _Toc118823081 \h </w:instrText>
+              <w:instrText xml:space="preserve"> PAGEREF _Toc118879538 \h </w:instrText>
             </w:r>
             <w:r>
               <w:rPr>
@@ -2395,7 +2441,7 @@
               <w:lang w:eastAsia="it-IT"/>
             </w:rPr>
           </w:pPr>
-          <w:hyperlink w:anchor="_Toc118823082" w:history="1">
+          <w:hyperlink w:anchor="_Toc118879539" w:history="1">
             <w:r>
               <w:rPr>
                 <w:rStyle w:val="Collegamentoipertestuale"/>
@@ -2425,7 +2471,7 @@
                 <w:noProof/>
                 <w:webHidden/>
               </w:rPr>
-              <w:instrText xml:space="preserve"> PAGEREF _Toc118823082 \h </w:instrText>
+              <w:instrText xml:space="preserve"> PAGEREF _Toc118879539 \h </w:instrText>
             </w:r>
             <w:r>
               <w:rPr>
@@ -2471,7 +2517,7 @@
               <w:lang w:eastAsia="it-IT"/>
             </w:rPr>
           </w:pPr>
-          <w:hyperlink w:anchor="_Toc118823083" w:history="1">
+          <w:hyperlink w:anchor="_Toc118879540" w:history="1">
             <w:r>
               <w:rPr>
                 <w:rStyle w:val="Collegamentoipertestuale"/>
@@ -2500,7 +2546,7 @@
                 <w:noProof/>
                 <w:webHidden/>
               </w:rPr>
-              <w:instrText xml:space="preserve"> PAGEREF _Toc118823083 \h </w:instrText>
+              <w:instrText xml:space="preserve"> PAGEREF _Toc118879540 \h </w:instrText>
             </w:r>
             <w:r>
               <w:rPr>
@@ -2546,7 +2592,7 @@
               <w:lang w:eastAsia="it-IT"/>
             </w:rPr>
           </w:pPr>
-          <w:hyperlink w:anchor="_Toc118823084" w:history="1">
+          <w:hyperlink w:anchor="_Toc118879541" w:history="1">
             <w:r>
               <w:rPr>
                 <w:rStyle w:val="Collegamentoipertestuale"/>
@@ -2575,7 +2621,7 @@
                 <w:noProof/>
                 <w:webHidden/>
               </w:rPr>
-              <w:instrText xml:space="preserve"> PAGEREF _Toc118823084 \h </w:instrText>
+              <w:instrText xml:space="preserve"> PAGEREF _Toc118879541 \h </w:instrText>
             </w:r>
             <w:r>
               <w:rPr>
@@ -2621,7 +2667,7 @@
               <w:lang w:eastAsia="it-IT"/>
             </w:rPr>
           </w:pPr>
-          <w:hyperlink w:anchor="_Toc118823085" w:history="1">
+          <w:hyperlink w:anchor="_Toc118879542" w:history="1">
             <w:r>
               <w:rPr>
                 <w:rStyle w:val="Collegamentoipertestuale"/>
@@ -2649,7 +2695,7 @@
                 <w:noProof/>
                 <w:webHidden/>
               </w:rPr>
-              <w:instrText xml:space="preserve"> PAGEREF _Toc118823085 \h </w:instrText>
+              <w:instrText xml:space="preserve"> PAGEREF _Toc118879542 \h </w:instrText>
             </w:r>
             <w:r>
               <w:rPr>
@@ -2695,7 +2741,7 @@
               <w:lang w:eastAsia="it-IT"/>
             </w:rPr>
           </w:pPr>
-          <w:hyperlink w:anchor="_Toc118823086" w:history="1">
+          <w:hyperlink w:anchor="_Toc118879543" w:history="1">
             <w:r>
               <w:rPr>
                 <w:rStyle w:val="Collegamentoipertestuale"/>
@@ -2724,7 +2770,7 @@
                 <w:noProof/>
                 <w:webHidden/>
               </w:rPr>
-              <w:instrText xml:space="preserve"> PAGEREF _Toc118823086 \h </w:instrText>
+              <w:instrText xml:space="preserve"> PAGEREF _Toc118879543 \h </w:instrText>
             </w:r>
             <w:r>
               <w:rPr>
@@ -2770,7 +2816,7 @@
               <w:lang w:eastAsia="it-IT"/>
             </w:rPr>
           </w:pPr>
-          <w:hyperlink w:anchor="_Toc118823087" w:history="1">
+          <w:hyperlink w:anchor="_Toc118879544" w:history="1">
             <w:r>
               <w:rPr>
                 <w:rStyle w:val="Collegamentoipertestuale"/>
@@ -2799,7 +2845,7 @@
                 <w:noProof/>
                 <w:webHidden/>
               </w:rPr>
-              <w:instrText xml:space="preserve"> PAGEREF _Toc118823087 \h </w:instrText>
+              <w:instrText xml:space="preserve"> PAGEREF _Toc118879544 \h </w:instrText>
             </w:r>
             <w:r>
               <w:rPr>
@@ -2845,7 +2891,7 @@
               <w:lang w:eastAsia="it-IT"/>
             </w:rPr>
           </w:pPr>
-          <w:hyperlink w:anchor="_Toc118823088" w:history="1">
+          <w:hyperlink w:anchor="_Toc118879545" w:history="1">
             <w:r>
               <w:rPr>
                 <w:rStyle w:val="Collegamentoipertestuale"/>
@@ -2882,7 +2928,7 @@
                 <w:noProof/>
                 <w:webHidden/>
               </w:rPr>
-              <w:instrText xml:space="preserve"> PAGEREF _Toc118823088 \h </w:instrText>
+              <w:instrText xml:space="preserve"> PAGEREF _Toc118879545 \h </w:instrText>
             </w:r>
             <w:r>
               <w:rPr>
@@ -2928,7 +2974,7 @@
               <w:lang w:eastAsia="it-IT"/>
             </w:rPr>
           </w:pPr>
-          <w:hyperlink w:anchor="_Toc118823089" w:history="1">
+          <w:hyperlink w:anchor="_Toc118879546" w:history="1">
             <w:r>
               <w:rPr>
                 <w:rStyle w:val="Collegamentoipertestuale"/>
@@ -2957,7 +3003,7 @@
                 <w:noProof/>
                 <w:webHidden/>
               </w:rPr>
-              <w:instrText xml:space="preserve"> PAGEREF _Toc118823089 \h </w:instrText>
+              <w:instrText xml:space="preserve"> PAGEREF _Toc118879546 \h </w:instrText>
             </w:r>
             <w:r>
               <w:rPr>
@@ -3003,7 +3049,7 @@
               <w:lang w:eastAsia="it-IT"/>
             </w:rPr>
           </w:pPr>
-          <w:hyperlink w:anchor="_Toc118823090" w:history="1">
+          <w:hyperlink w:anchor="_Toc118879547" w:history="1">
             <w:r>
               <w:rPr>
                 <w:rStyle w:val="Collegamentoipertestuale"/>
@@ -3032,7 +3078,7 @@
                 <w:noProof/>
                 <w:webHidden/>
               </w:rPr>
-              <w:instrText xml:space="preserve"> PAGEREF _Toc118823090 \h </w:instrText>
+              <w:instrText xml:space="preserve"> PAGEREF _Toc118879547 \h </w:instrText>
             </w:r>
             <w:r>
               <w:rPr>
@@ -3078,7 +3124,7 @@
               <w:lang w:eastAsia="it-IT"/>
             </w:rPr>
           </w:pPr>
-          <w:hyperlink w:anchor="_Toc118823091" w:history="1">
+          <w:hyperlink w:anchor="_Toc118879548" w:history="1">
             <w:r>
               <w:rPr>
                 <w:rStyle w:val="Collegamentoipertestuale"/>
@@ -3108,7 +3154,7 @@
                 <w:noProof/>
                 <w:webHidden/>
               </w:rPr>
-              <w:instrText xml:space="preserve"> PAGEREF _Toc118823091 \h </w:instrText>
+              <w:instrText xml:space="preserve"> PAGEREF _Toc118879548 \h </w:instrText>
             </w:r>
             <w:r>
               <w:rPr>
@@ -3154,7 +3200,7 @@
               <w:lang w:eastAsia="it-IT"/>
             </w:rPr>
           </w:pPr>
-          <w:hyperlink w:anchor="_Toc118823092" w:history="1">
+          <w:hyperlink w:anchor="_Toc118879549" w:history="1">
             <w:r>
               <w:rPr>
                 <w:rStyle w:val="Collegamentoipertestuale"/>
@@ -3183,7 +3229,7 @@
                 <w:noProof/>
                 <w:webHidden/>
               </w:rPr>
-              <w:instrText xml:space="preserve"> PAGEREF _Toc118823092 \h </w:instrText>
+              <w:instrText xml:space="preserve"> PAGEREF _Toc118879549 \h </w:instrText>
             </w:r>
             <w:r>
               <w:rPr>
@@ -3229,7 +3275,7 @@
               <w:lang w:eastAsia="it-IT"/>
             </w:rPr>
           </w:pPr>
-          <w:hyperlink w:anchor="_Toc118823093" w:history="1">
+          <w:hyperlink w:anchor="_Toc118879550" w:history="1">
             <w:r>
               <w:rPr>
                 <w:rStyle w:val="Collegamentoipertestuale"/>
@@ -3258,7 +3304,7 @@
                 <w:noProof/>
                 <w:webHidden/>
               </w:rPr>
-              <w:instrText xml:space="preserve"> PAGEREF _Toc118823093 \h </w:instrText>
+              <w:instrText xml:space="preserve"> PAGEREF _Toc118879550 \h </w:instrText>
             </w:r>
             <w:r>
               <w:rPr>
@@ -3304,7 +3350,7 @@
               <w:lang w:eastAsia="it-IT"/>
             </w:rPr>
           </w:pPr>
-          <w:hyperlink w:anchor="_Toc118823094" w:history="1">
+          <w:hyperlink w:anchor="_Toc118879551" w:history="1">
             <w:r>
               <w:rPr>
                 <w:rStyle w:val="Collegamentoipertestuale"/>
@@ -3333,7 +3379,7 @@
                 <w:noProof/>
                 <w:webHidden/>
               </w:rPr>
-              <w:instrText xml:space="preserve"> PAGEREF _Toc118823094 \h </w:instrText>
+              <w:instrText xml:space="preserve"> PAGEREF _Toc118879551 \h </w:instrText>
             </w:r>
             <w:r>
               <w:rPr>
@@ -3379,7 +3425,7 @@
               <w:lang w:eastAsia="it-IT"/>
             </w:rPr>
           </w:pPr>
-          <w:hyperlink w:anchor="_Toc118823095" w:history="1">
+          <w:hyperlink w:anchor="_Toc118879552" w:history="1">
             <w:r>
               <w:rPr>
                 <w:rStyle w:val="Collegamentoipertestuale"/>
@@ -3407,7 +3453,7 @@
                 <w:noProof/>
                 <w:webHidden/>
               </w:rPr>
-              <w:instrText xml:space="preserve"> PAGEREF _Toc118823095 \h </w:instrText>
+              <w:instrText xml:space="preserve"> PAGEREF _Toc118879552 \h </w:instrText>
             </w:r>
             <w:r>
               <w:rPr>
@@ -3453,7 +3499,7 @@
               <w:lang w:eastAsia="it-IT"/>
             </w:rPr>
           </w:pPr>
-          <w:hyperlink w:anchor="_Toc118823096" w:history="1">
+          <w:hyperlink w:anchor="_Toc118879553" w:history="1">
             <w:r>
               <w:rPr>
                 <w:rStyle w:val="Collegamentoipertestuale"/>
@@ -3482,7 +3528,7 @@
                 <w:noProof/>
                 <w:webHidden/>
               </w:rPr>
-              <w:instrText xml:space="preserve"> PAGEREF _Toc118823096 \h </w:instrText>
+              <w:instrText xml:space="preserve"> PAGEREF _Toc118879553 \h </w:instrText>
             </w:r>
             <w:r>
               <w:rPr>
@@ -3528,7 +3574,7 @@
               <w:lang w:eastAsia="it-IT"/>
             </w:rPr>
           </w:pPr>
-          <w:hyperlink w:anchor="_Toc118823097" w:history="1">
+          <w:hyperlink w:anchor="_Toc118879554" w:history="1">
             <w:r>
               <w:rPr>
                 <w:rStyle w:val="Collegamentoipertestuale"/>
@@ -3557,7 +3603,7 @@
                 <w:noProof/>
                 <w:webHidden/>
               </w:rPr>
-              <w:instrText xml:space="preserve"> PAGEREF _Toc118823097 \h </w:instrText>
+              <w:instrText xml:space="preserve"> PAGEREF _Toc118879554 \h </w:instrText>
             </w:r>
             <w:r>
               <w:rPr>
@@ -3603,7 +3649,7 @@
               <w:lang w:eastAsia="it-IT"/>
             </w:rPr>
           </w:pPr>
-          <w:hyperlink w:anchor="_Toc118823098" w:history="1">
+          <w:hyperlink w:anchor="_Toc118879555" w:history="1">
             <w:r>
               <w:rPr>
                 <w:rStyle w:val="Collegamentoipertestuale"/>
@@ -3631,7 +3677,7 @@
                 <w:noProof/>
                 <w:webHidden/>
               </w:rPr>
-              <w:instrText xml:space="preserve"> PAGEREF _Toc118823098 \h </w:instrText>
+              <w:instrText xml:space="preserve"> PAGEREF _Toc118879555 \h </w:instrText>
             </w:r>
             <w:r>
               <w:rPr>
@@ -3677,7 +3723,7 @@
               <w:lang w:eastAsia="it-IT"/>
             </w:rPr>
           </w:pPr>
-          <w:hyperlink w:anchor="_Toc118823099" w:history="1">
+          <w:hyperlink w:anchor="_Toc118879556" w:history="1">
             <w:r>
               <w:rPr>
                 <w:rStyle w:val="Collegamentoipertestuale"/>
@@ -3706,7 +3752,7 @@
                 <w:noProof/>
                 <w:webHidden/>
               </w:rPr>
-              <w:instrText xml:space="preserve"> PAGEREF _Toc118823099 \h </w:instrText>
+              <w:instrText xml:space="preserve"> PAGEREF _Toc118879556 \h </w:instrText>
             </w:r>
             <w:r>
               <w:rPr>
@@ -3752,7 +3798,7 @@
               <w:lang w:eastAsia="it-IT"/>
             </w:rPr>
           </w:pPr>
-          <w:hyperlink w:anchor="_Toc118823100" w:history="1">
+          <w:hyperlink w:anchor="_Toc118879557" w:history="1">
             <w:r>
               <w:rPr>
                 <w:rStyle w:val="Collegamentoipertestuale"/>
@@ -3781,7 +3827,7 @@
                 <w:noProof/>
                 <w:webHidden/>
               </w:rPr>
-              <w:instrText xml:space="preserve"> PAGEREF _Toc118823100 \h </w:instrText>
+              <w:instrText xml:space="preserve"> PAGEREF _Toc118879557 \h </w:instrText>
             </w:r>
             <w:r>
               <w:rPr>
@@ -3827,7 +3873,7 @@
               <w:lang w:eastAsia="it-IT"/>
             </w:rPr>
           </w:pPr>
-          <w:hyperlink w:anchor="_Toc118823101" w:history="1">
+          <w:hyperlink w:anchor="_Toc118879558" w:history="1">
             <w:r>
               <w:rPr>
                 <w:rStyle w:val="Collegamentoipertestuale"/>
@@ -3856,7 +3902,7 @@
                 <w:noProof/>
                 <w:webHidden/>
               </w:rPr>
-              <w:instrText xml:space="preserve"> PAGEREF _Toc118823101 \h </w:instrText>
+              <w:instrText xml:space="preserve"> PAGEREF _Toc118879558 \h </w:instrText>
             </w:r>
             <w:r>
               <w:rPr>
@@ -3902,7 +3948,7 @@
               <w:lang w:eastAsia="it-IT"/>
             </w:rPr>
           </w:pPr>
-          <w:hyperlink w:anchor="_Toc118823102" w:history="1">
+          <w:hyperlink w:anchor="_Toc118879559" w:history="1">
             <w:r>
               <w:rPr>
                 <w:rStyle w:val="Collegamentoipertestuale"/>
@@ -3930,7 +3976,7 @@
                 <w:noProof/>
                 <w:webHidden/>
               </w:rPr>
-              <w:instrText xml:space="preserve"> PAGEREF _Toc118823102 \h </w:instrText>
+              <w:instrText xml:space="preserve"> PAGEREF _Toc118879559 \h </w:instrText>
             </w:r>
             <w:r>
               <w:rPr>
@@ -3976,7 +4022,7 @@
               <w:lang w:eastAsia="it-IT"/>
             </w:rPr>
           </w:pPr>
-          <w:hyperlink w:anchor="_Toc118823103" w:history="1">
+          <w:hyperlink w:anchor="_Toc118879560" w:history="1">
             <w:r>
               <w:rPr>
                 <w:rStyle w:val="Collegamentoipertestuale"/>
@@ -4005,7 +4051,7 @@
                 <w:noProof/>
                 <w:webHidden/>
               </w:rPr>
-              <w:instrText xml:space="preserve"> PAGEREF _Toc118823103 \h </w:instrText>
+              <w:instrText xml:space="preserve"> PAGEREF _Toc118879560 \h </w:instrText>
             </w:r>
             <w:r>
               <w:rPr>
@@ -4051,7 +4097,7 @@
               <w:lang w:eastAsia="it-IT"/>
             </w:rPr>
           </w:pPr>
-          <w:hyperlink w:anchor="_Toc118823104" w:history="1">
+          <w:hyperlink w:anchor="_Toc118879561" w:history="1">
             <w:r>
               <w:rPr>
                 <w:rStyle w:val="Collegamentoipertestuale"/>
@@ -4080,7 +4126,7 @@
                 <w:noProof/>
                 <w:webHidden/>
               </w:rPr>
-              <w:instrText xml:space="preserve"> PAGEREF _Toc118823104 \h </w:instrText>
+              <w:instrText xml:space="preserve"> PAGEREF _Toc118879561 \h </w:instrText>
             </w:r>
             <w:r>
               <w:rPr>
@@ -4101,6 +4147,156 @@
                 <w:webHidden/>
               </w:rPr>
               <w:t>25</w:t>
+            </w:r>
+            <w:r>
+              <w:rPr>
+                <w:noProof/>
+                <w:webHidden/>
+              </w:rPr>
+              <w:fldChar w:fldCharType="end"/>
+            </w:r>
+          </w:hyperlink>
+        </w:p>
+        <w:p>
+          <w:pPr>
+            <w:pStyle w:val="Sommario1"/>
+            <w:tabs>
+              <w:tab w:val="right" w:leader="dot" w:pos="9628"/>
+            </w:tabs>
+            <w:rPr>
+              <w:rFonts w:asciiTheme="minorHAnsi" w:eastAsiaTheme="minorEastAsia" w:hAnsiTheme="minorHAnsi" w:cstheme="minorBidi"/>
+              <w:noProof/>
+              <w:kern w:val="0"/>
+              <w:sz w:val="22"/>
+              <w:szCs w:val="22"/>
+              <w:lang w:eastAsia="it-IT"/>
+            </w:rPr>
+          </w:pPr>
+          <w:hyperlink w:anchor="_Toc118879562" w:history="1">
+            <w:r>
+              <w:rPr>
+                <w:rStyle w:val="Collegamentoipertestuale"/>
+                <w:b/>
+                <w:bCs/>
+                <w:noProof/>
+              </w:rPr>
+              <w:t>Class Diagram</w:t>
+            </w:r>
+            <w:r>
+              <w:rPr>
+                <w:noProof/>
+                <w:webHidden/>
+              </w:rPr>
+              <w:tab/>
+            </w:r>
+            <w:r>
+              <w:rPr>
+                <w:noProof/>
+                <w:webHidden/>
+              </w:rPr>
+              <w:fldChar w:fldCharType="begin"/>
+            </w:r>
+            <w:r>
+              <w:rPr>
+                <w:noProof/>
+                <w:webHidden/>
+              </w:rPr>
+              <w:instrText xml:space="preserve"> PAGEREF _Toc118879562 \h </w:instrText>
+            </w:r>
+            <w:r>
+              <w:rPr>
+                <w:noProof/>
+                <w:webHidden/>
+              </w:rPr>
+            </w:r>
+            <w:r>
+              <w:rPr>
+                <w:noProof/>
+                <w:webHidden/>
+              </w:rPr>
+              <w:fldChar w:fldCharType="separate"/>
+            </w:r>
+            <w:r>
+              <w:rPr>
+                <w:noProof/>
+                <w:webHidden/>
+              </w:rPr>
+              <w:t>25</w:t>
+            </w:r>
+            <w:r>
+              <w:rPr>
+                <w:noProof/>
+                <w:webHidden/>
+              </w:rPr>
+              <w:fldChar w:fldCharType="end"/>
+            </w:r>
+          </w:hyperlink>
+        </w:p>
+        <w:p>
+          <w:pPr>
+            <w:pStyle w:val="Sommario1"/>
+            <w:tabs>
+              <w:tab w:val="right" w:leader="dot" w:pos="9628"/>
+            </w:tabs>
+            <w:rPr>
+              <w:rFonts w:asciiTheme="minorHAnsi" w:eastAsiaTheme="minorEastAsia" w:hAnsiTheme="minorHAnsi" w:cstheme="minorBidi"/>
+              <w:noProof/>
+              <w:kern w:val="0"/>
+              <w:sz w:val="22"/>
+              <w:szCs w:val="22"/>
+              <w:lang w:eastAsia="it-IT"/>
+            </w:rPr>
+          </w:pPr>
+          <w:hyperlink w:anchor="_Toc118879563" w:history="1">
+            <w:r>
+              <w:rPr>
+                <w:rStyle w:val="Collegamentoipertestuale"/>
+                <w:b/>
+                <w:bCs/>
+                <w:noProof/>
+              </w:rPr>
+              <w:t>Mockup</w:t>
+            </w:r>
+            <w:r>
+              <w:rPr>
+                <w:noProof/>
+                <w:webHidden/>
+              </w:rPr>
+              <w:tab/>
+            </w:r>
+            <w:r>
+              <w:rPr>
+                <w:noProof/>
+                <w:webHidden/>
+              </w:rPr>
+              <w:fldChar w:fldCharType="begin"/>
+            </w:r>
+            <w:r>
+              <w:rPr>
+                <w:noProof/>
+                <w:webHidden/>
+              </w:rPr>
+              <w:instrText xml:space="preserve"> PAGEREF _Toc118879563 \h </w:instrText>
+            </w:r>
+            <w:r>
+              <w:rPr>
+                <w:noProof/>
+                <w:webHidden/>
+              </w:rPr>
+            </w:r>
+            <w:r>
+              <w:rPr>
+                <w:noProof/>
+                <w:webHidden/>
+              </w:rPr>
+              <w:fldChar w:fldCharType="separate"/>
+            </w:r>
+            <w:r>
+              <w:rPr>
+                <w:noProof/>
+                <w:webHidden/>
+              </w:rPr>
+              <w:t>26</w:t>
             </w:r>
             <w:r>
               <w:rPr>
@@ -4155,7 +4351,8 @@
           <w:color w:val="000000" w:themeColor="text1"/>
         </w:rPr>
       </w:pPr>
-      <w:bookmarkStart w:id="2" w:name="_Toc118823058"/>
+      <w:bookmarkStart w:id="2" w:name="_Toc118879515"/>
+      <w:proofErr w:type="spellStart"/>
       <w:r>
         <w:rPr>
           <w:rFonts w:ascii="Times New Roman" w:hAnsi="Times New Roman" w:cs="Times New Roman"/>
@@ -4168,6 +4365,7 @@
       </w:r>
       <w:bookmarkEnd w:id="1"/>
       <w:bookmarkEnd w:id="2"/>
+      <w:proofErr w:type="spellEnd"/>
     </w:p>
     <w:p>
       <w:pPr>
@@ -4186,7 +4384,7 @@
         </w:rPr>
       </w:pPr>
       <w:bookmarkStart w:id="3" w:name="_Toc117977226"/>
-      <w:bookmarkStart w:id="4" w:name="_Toc118823059"/>
+      <w:bookmarkStart w:id="4" w:name="_Toc118879516"/>
       <w:r>
         <w:rPr>
           <w:rFonts w:ascii="Times New Roman" w:hAnsi="Times New Roman" w:cs="Times New Roman"/>
@@ -4215,7 +4413,7 @@
         </w:rPr>
       </w:pPr>
       <w:bookmarkStart w:id="5" w:name="_Toc117977227"/>
-      <w:bookmarkStart w:id="6" w:name="_Toc118823060"/>
+      <w:bookmarkStart w:id="6" w:name="_Toc118879517"/>
       <w:r>
         <w:rPr>
           <w:rFonts w:ascii="Times New Roman" w:eastAsia="Times New Roman" w:hAnsi="Times New Roman" w:cs="Times New Roman"/>
@@ -4294,7 +4492,25 @@
           <w:szCs w:val="28"/>
           <w:highlight w:val="cyan"/>
         </w:rPr>
-        <w:t>Alex seleziona 2 barattoli di pittura da aggiungere al carrello</w:t>
+        <w:t xml:space="preserve">Alex seleziona </w:t>
+      </w:r>
+      <w:proofErr w:type="gramStart"/>
+      <w:r>
+        <w:rPr>
+          <w:sz w:val="28"/>
+          <w:szCs w:val="28"/>
+          <w:highlight w:val="cyan"/>
+        </w:rPr>
+        <w:t>2</w:t>
+      </w:r>
+      <w:proofErr w:type="gramEnd"/>
+      <w:r>
+        <w:rPr>
+          <w:sz w:val="28"/>
+          <w:szCs w:val="28"/>
+          <w:highlight w:val="cyan"/>
+        </w:rPr>
+        <w:t xml:space="preserve"> barattoli di pittura da aggiungere al carrello</w:t>
       </w:r>
       <w:r>
         <w:rPr>
@@ -4309,7 +4525,43 @@
           <w:szCs w:val="28"/>
           <w:highlight w:val="magenta"/>
         </w:rPr>
-        <w:t>Alex inserisce “ferraraalex” nel campo username e inserisce “alex124” nel campo password. Il sito rifiuta tali credenziali rispondendo “username o password errate”. Alex, dunque, inserisce “ferraraalex” nel campo username e inserisce “alex123” nel campo password.</w:t>
+        <w:t>Alex inserisce “</w:t>
+      </w:r>
+      <w:proofErr w:type="spellStart"/>
+      <w:r>
+        <w:rPr>
+          <w:sz w:val="28"/>
+          <w:szCs w:val="28"/>
+          <w:highlight w:val="magenta"/>
+        </w:rPr>
+        <w:t>ferraraalex</w:t>
+      </w:r>
+      <w:proofErr w:type="spellEnd"/>
+      <w:r>
+        <w:rPr>
+          <w:sz w:val="28"/>
+          <w:szCs w:val="28"/>
+          <w:highlight w:val="magenta"/>
+        </w:rPr>
+        <w:t>” nel campo username e inserisce “alex124” nel campo password. Il sito rifiuta tali credenziali rispondendo “username o password errate”. Alex, dunque, inserisce “</w:t>
+      </w:r>
+      <w:proofErr w:type="spellStart"/>
+      <w:r>
+        <w:rPr>
+          <w:sz w:val="28"/>
+          <w:szCs w:val="28"/>
+          <w:highlight w:val="magenta"/>
+        </w:rPr>
+        <w:t>ferraraalex</w:t>
+      </w:r>
+      <w:proofErr w:type="spellEnd"/>
+      <w:r>
+        <w:rPr>
+          <w:sz w:val="28"/>
+          <w:szCs w:val="28"/>
+          <w:highlight w:val="magenta"/>
+        </w:rPr>
+        <w:t>” nel campo username e inserisce “alex123” nel campo password.</w:t>
       </w:r>
       <w:r>
         <w:rPr>
@@ -4357,14 +4609,48 @@
           <w:szCs w:val="28"/>
           <w:highlight w:val="red"/>
         </w:rPr>
-        <w:t>conoscendo già il prodotto inserisce un feedback positivo, basandosi sulle valutazioni rilasciate dagli altri utenti</w:t>
+        <w:t xml:space="preserve">conoscendo già il prodotto inserisce un </w:t>
+      </w:r>
+      <w:proofErr w:type="gramStart"/>
+      <w:r>
+        <w:rPr>
+          <w:sz w:val="28"/>
+          <w:szCs w:val="28"/>
+          <w:highlight w:val="red"/>
+        </w:rPr>
+        <w:t>feedback</w:t>
+      </w:r>
+      <w:proofErr w:type="gramEnd"/>
+      <w:r>
+        <w:rPr>
+          <w:sz w:val="28"/>
+          <w:szCs w:val="28"/>
+          <w:highlight w:val="red"/>
+        </w:rPr>
+        <w:t xml:space="preserve"> positivo, basandosi sulle valutazioni rilasciate dagli altri utenti</w:t>
       </w:r>
       <w:r>
         <w:rPr>
           <w:sz w:val="28"/>
           <w:szCs w:val="28"/>
         </w:rPr>
-        <w:t>, dopodiché aggiunge tale prodotto al carrello, in modo analogo all’articolo precedente, senza rieffettuare il login.</w:t>
+        <w:t xml:space="preserve">, dopodiché aggiunge tale prodotto al carrello, in modo analogo all’articolo precedente, senza </w:t>
+      </w:r>
+      <w:proofErr w:type="spellStart"/>
+      <w:r>
+        <w:rPr>
+          <w:sz w:val="28"/>
+          <w:szCs w:val="28"/>
+        </w:rPr>
+        <w:t>rieffettuare</w:t>
+      </w:r>
+      <w:proofErr w:type="spellEnd"/>
+      <w:r>
+        <w:rPr>
+          <w:sz w:val="28"/>
+          <w:szCs w:val="28"/>
+        </w:rPr>
+        <w:t xml:space="preserve"> il login.</w:t>
       </w:r>
     </w:p>
     <w:p>
@@ -4382,7 +4668,23 @@
           <w:sz w:val="28"/>
           <w:szCs w:val="28"/>
         </w:rPr>
-        <w:t xml:space="preserve">Mediante la barra di ricerca, situata nell’header, Alex digita la parola “pennello”. Il sito </w:t>
+        <w:t>Mediante la barra di ricerca, situata nell’</w:t>
+      </w:r>
+      <w:proofErr w:type="spellStart"/>
+      <w:r>
+        <w:rPr>
+          <w:sz w:val="28"/>
+          <w:szCs w:val="28"/>
+        </w:rPr>
+        <w:t>header</w:t>
+      </w:r>
+      <w:proofErr w:type="spellEnd"/>
+      <w:r>
+        <w:rPr>
+          <w:sz w:val="28"/>
+          <w:szCs w:val="28"/>
+        </w:rPr>
+        <w:t xml:space="preserve">, Alex digita la parola “pennello”. Il sito </w:t>
       </w:r>
       <w:r>
         <w:rPr>
@@ -4538,7 +4840,7 @@
         </w:rPr>
       </w:pPr>
       <w:bookmarkStart w:id="7" w:name="_Toc117977228"/>
-      <w:bookmarkStart w:id="8" w:name="_Toc118823061"/>
+      <w:bookmarkStart w:id="8" w:name="_Toc118879518"/>
       <w:r>
         <w:rPr>
           <w:rFonts w:ascii="Times New Roman" w:hAnsi="Times New Roman" w:cs="Times New Roman"/>
@@ -4578,7 +4880,7 @@
         </w:rPr>
       </w:pPr>
       <w:bookmarkStart w:id="9" w:name="_Toc117977229"/>
-      <w:bookmarkStart w:id="10" w:name="_Toc118823062"/>
+      <w:bookmarkStart w:id="10" w:name="_Toc118879519"/>
       <w:r>
         <w:rPr>
           <w:rFonts w:ascii="Times New Roman" w:hAnsi="Times New Roman" w:cs="Times New Roman"/>
@@ -4612,7 +4914,25 @@
           <w:sz w:val="28"/>
           <w:szCs w:val="28"/>
         </w:rPr>
-        <w:t xml:space="preserve">Luigi (l’amministratore del catalogo), accede alla homepage del sito, seleziona la pagina di Login ed effettua l’accesso con le credenziali username: “luigi” e password: “dechiaraluigi”. Il sito lo autentica riportandolo alla homepage. </w:t>
+        <w:t>Luigi (l’amministratore del catalogo), accede alla homepage del sito, seleziona la pagina di Login ed effettua l’accesso con le credenziali username: “luigi” e password: “</w:t>
+      </w:r>
+      <w:proofErr w:type="spellStart"/>
+      <w:r>
+        <w:rPr>
+          <w:color w:val="111111"/>
+          <w:sz w:val="28"/>
+          <w:szCs w:val="28"/>
+        </w:rPr>
+        <w:t>dechiaraluigi</w:t>
+      </w:r>
+      <w:proofErr w:type="spellEnd"/>
+      <w:r>
+        <w:rPr>
+          <w:color w:val="111111"/>
+          <w:sz w:val="28"/>
+          <w:szCs w:val="28"/>
+        </w:rPr>
+        <w:t xml:space="preserve">”. Il sito lo autentica riportandolo alla homepage. </w:t>
       </w:r>
       <w:r>
         <w:rPr>
@@ -4717,7 +5037,25 @@
           <w:sz w:val="28"/>
           <w:szCs w:val="28"/>
         </w:rPr>
-        <w:t xml:space="preserve"> Luigi seleziona l’articolo “Tavolo in legno”, mediante il nome e il rispettivo codice Articolo, con l’obiettivo di ridurre il prezzo. Il sistema restituisce le informazioni del prodotto mediante un apposito form. Luigi modifica il campo prezzo da 150.00€ a 130.00€ e conferma la modifica, così che il sistema modifichi il prezzo dell’articolo nel catalogo. </w:t>
+        <w:t xml:space="preserve"> Luigi seleziona l’articolo “Tavolo in legno”, mediante il nome e il rispettivo codice Articolo, con l’obiettivo di ridurre il prezzo. Il sistema restituisce le informazioni del prodotto mediante un apposito </w:t>
+      </w:r>
+      <w:proofErr w:type="spellStart"/>
+      <w:r>
+        <w:rPr>
+          <w:color w:val="111111"/>
+          <w:sz w:val="28"/>
+          <w:szCs w:val="28"/>
+        </w:rPr>
+        <w:t>form</w:t>
+      </w:r>
+      <w:proofErr w:type="spellEnd"/>
+      <w:r>
+        <w:rPr>
+          <w:color w:val="111111"/>
+          <w:sz w:val="28"/>
+          <w:szCs w:val="28"/>
+        </w:rPr>
+        <w:t xml:space="preserve">. Luigi modifica il campo prezzo da 150.00€ a 130.00€ e conferma la modifica, così che il sistema modifichi il prezzo dell’articolo nel catalogo. </w:t>
       </w:r>
     </w:p>
     <w:p>
@@ -4763,7 +5101,43 @@
           <w:sz w:val="28"/>
           <w:szCs w:val="28"/>
         </w:rPr>
-        <w:t xml:space="preserve"> Il sistema restituisce una pagina avente un form da compilare per l’inserimento dei dati relativi all’articolo. Luigi inserisce il nome, la foto, la descrizione della sedia, il prezzo e seleziona una categoria tra quelle già presenti nel catalogo: “Arredamento Interni” e conferma l’aggiunta dell’articolo nel catalogo. Il sistema comunica l’avvenuto inserimento del prodotto nel catalogo ed effettua un autorefresh del sito permettendo agli utenti loggati di visualizzare in tempo reale i prodotti appena inseriti o modificati.</w:t>
+        <w:t xml:space="preserve"> Il sistema restituisce una pagina avente un </w:t>
+      </w:r>
+      <w:proofErr w:type="spellStart"/>
+      <w:r>
+        <w:rPr>
+          <w:color w:val="111111"/>
+          <w:sz w:val="28"/>
+          <w:szCs w:val="28"/>
+        </w:rPr>
+        <w:t>form</w:t>
+      </w:r>
+      <w:proofErr w:type="spellEnd"/>
+      <w:r>
+        <w:rPr>
+          <w:color w:val="111111"/>
+          <w:sz w:val="28"/>
+          <w:szCs w:val="28"/>
+        </w:rPr>
+        <w:t xml:space="preserve"> da compilare per l’inserimento dei dati relativi all’articolo. Luigi inserisce il nome, la foto, la descrizione della sedia, il prezzo e seleziona una categoria tra quelle già presenti nel catalogo: “Arredamento Interni” e conferma l’aggiunta dell’articolo nel catalogo. Il sistema comunica l’avvenuto inserimento del prodotto nel catalogo ed effettua un </w:t>
+      </w:r>
+      <w:proofErr w:type="spellStart"/>
+      <w:r>
+        <w:rPr>
+          <w:color w:val="111111"/>
+          <w:sz w:val="28"/>
+          <w:szCs w:val="28"/>
+        </w:rPr>
+        <w:t>autorefresh</w:t>
+      </w:r>
+      <w:proofErr w:type="spellEnd"/>
+      <w:r>
+        <w:rPr>
+          <w:color w:val="111111"/>
+          <w:sz w:val="28"/>
+          <w:szCs w:val="28"/>
+        </w:rPr>
+        <w:t xml:space="preserve"> del sito permettendo agli utenti loggati di visualizzare in tempo reale i prodotti appena inseriti o modificati.</w:t>
       </w:r>
     </w:p>
     <w:p>
@@ -4915,7 +5289,7 @@
         </w:rPr>
       </w:pPr>
       <w:bookmarkStart w:id="11" w:name="_Toc117977230"/>
-      <w:bookmarkStart w:id="12" w:name="_Toc118823063"/>
+      <w:bookmarkStart w:id="12" w:name="_Toc118879520"/>
       <w:r>
         <w:rPr>
           <w:rFonts w:ascii="Times New Roman" w:hAnsi="Times New Roman" w:cs="Times New Roman"/>
@@ -4945,7 +5319,7 @@
         </w:rPr>
       </w:pPr>
       <w:bookmarkStart w:id="13" w:name="_Toc117977231"/>
-      <w:bookmarkStart w:id="14" w:name="_Toc118823064"/>
+      <w:bookmarkStart w:id="14" w:name="_Toc118879521"/>
       <w:r>
         <w:rPr>
           <w:rFonts w:ascii="Times New Roman" w:hAnsi="Times New Roman" w:cs="Times New Roman"/>
@@ -5133,7 +5507,7 @@
               </w:rPr>
             </w:pPr>
             <w:bookmarkStart w:id="15" w:name="_Toc117977232"/>
-            <w:bookmarkStart w:id="16" w:name="_Toc118823065"/>
+            <w:bookmarkStart w:id="16" w:name="_Toc118879522"/>
             <w:r>
               <w:rPr>
                 <w:color w:val="000000" w:themeColor="text1"/>
@@ -5353,8 +5727,20 @@
                 <w:color w:val="FFFFFF"/>
                 <w:u w:color="FFFFFF"/>
               </w:rPr>
-              <w:t>Entry Condition</w:t>
-            </w:r>
+              <w:t xml:space="preserve">Entry </w:t>
+            </w:r>
+            <w:proofErr w:type="spellStart"/>
+            <w:r>
+              <w:rPr>
+                <w:rFonts w:ascii="Cambria" w:hAnsi="Cambria"/>
+                <w:b/>
+                <w:bCs/>
+                <w:color w:val="FFFFFF"/>
+                <w:u w:color="FFFFFF"/>
+              </w:rPr>
+              <w:t>Condition</w:t>
+            </w:r>
+            <w:proofErr w:type="spellEnd"/>
           </w:p>
         </w:tc>
         <w:tc>
@@ -5576,7 +5962,25 @@
                 <w:sz w:val="22"/>
                 <w:szCs w:val="22"/>
               </w:rPr>
-              <w:t>L’utente inserisce nella searchbar una parola chiave</w:t>
+              <w:t xml:space="preserve">L’utente inserisce nella </w:t>
+            </w:r>
+            <w:proofErr w:type="spellStart"/>
+            <w:r>
+              <w:rPr>
+                <w:rFonts w:ascii="Calibri Light" w:hAnsi="Calibri Light"/>
+                <w:sz w:val="22"/>
+                <w:szCs w:val="22"/>
+              </w:rPr>
+              <w:t>searchbar</w:t>
+            </w:r>
+            <w:proofErr w:type="spellEnd"/>
+            <w:r>
+              <w:rPr>
+                <w:rFonts w:ascii="Calibri Light" w:hAnsi="Calibri Light"/>
+                <w:sz w:val="22"/>
+                <w:szCs w:val="22"/>
+              </w:rPr>
+              <w:t xml:space="preserve"> una parola chiave</w:t>
             </w:r>
             <w:r>
               <w:rPr>
@@ -5853,7 +6257,29 @@
                 <w:color w:val="FFFFFF"/>
                 <w:u w:color="FFFFFF"/>
               </w:rPr>
-              <w:t>Exit Condition On Success</w:t>
+              <w:t xml:space="preserve">Exit </w:t>
+            </w:r>
+            <w:proofErr w:type="spellStart"/>
+            <w:r>
+              <w:rPr>
+                <w:rFonts w:ascii="Cambria" w:hAnsi="Cambria"/>
+                <w:b/>
+                <w:bCs/>
+                <w:color w:val="FFFFFF"/>
+                <w:u w:color="FFFFFF"/>
+              </w:rPr>
+              <w:t>Condition</w:t>
+            </w:r>
+            <w:proofErr w:type="spellEnd"/>
+            <w:r>
+              <w:rPr>
+                <w:rFonts w:ascii="Cambria" w:hAnsi="Cambria"/>
+                <w:b/>
+                <w:bCs/>
+                <w:color w:val="FFFFFF"/>
+                <w:u w:color="FFFFFF"/>
+              </w:rPr>
+              <w:t xml:space="preserve"> On Success</w:t>
             </w:r>
           </w:p>
         </w:tc>
@@ -6002,8 +6428,20 @@
                 <w:u w:color="FFFFFF"/>
               </w:rPr>
               <w:lastRenderedPageBreak/>
-              <w:t>User Priority</w:t>
-            </w:r>
+              <w:t xml:space="preserve">User </w:t>
+            </w:r>
+            <w:proofErr w:type="spellStart"/>
+            <w:r>
+              <w:rPr>
+                <w:rFonts w:ascii="Cambria" w:hAnsi="Cambria"/>
+                <w:b/>
+                <w:bCs/>
+                <w:color w:val="FFFFFF"/>
+                <w:u w:color="FFFFFF"/>
+              </w:rPr>
+              <w:t>Priority</w:t>
+            </w:r>
+            <w:proofErr w:type="spellEnd"/>
           </w:p>
         </w:tc>
         <w:tc>
@@ -6066,7 +6504,7 @@
       </w:pPr>
       <w:bookmarkStart w:id="17" w:name="_Toc117977233"/>
       <w:bookmarkStart w:id="18" w:name="_Hlk87953161"/>
-      <w:bookmarkStart w:id="19" w:name="_Toc118823066"/>
+      <w:bookmarkStart w:id="19" w:name="_Toc118879523"/>
       <w:r>
         <w:rPr>
           <w:rFonts w:ascii="Times New Roman" w:hAnsi="Times New Roman" w:cs="Times New Roman"/>
@@ -6240,7 +6678,23 @@
                 <w:sz w:val="28"/>
                 <w:szCs w:val="28"/>
               </w:rPr>
-              <w:t>Può assumere due valori “categoria” / “nomeArticolo”</w:t>
+              <w:t>Può assumere due valori “categoria” / “</w:t>
+            </w:r>
+            <w:proofErr w:type="spellStart"/>
+            <w:r>
+              <w:rPr>
+                <w:sz w:val="28"/>
+                <w:szCs w:val="28"/>
+              </w:rPr>
+              <w:t>nomeArticolo</w:t>
+            </w:r>
+            <w:proofErr w:type="spellEnd"/>
+            <w:r>
+              <w:rPr>
+                <w:sz w:val="28"/>
+                <w:szCs w:val="28"/>
+              </w:rPr>
+              <w:t>”</w:t>
             </w:r>
           </w:p>
         </w:tc>
@@ -6353,7 +6807,7 @@
           <w:szCs w:val="32"/>
         </w:rPr>
       </w:pPr>
-      <w:bookmarkStart w:id="20" w:name="_Toc118823067"/>
+      <w:bookmarkStart w:id="20" w:name="_Toc118879524"/>
       <w:r>
         <w:rPr>
           <w:rFonts w:ascii="Times New Roman" w:hAnsi="Times New Roman" w:cs="Times New Roman"/>
@@ -6523,7 +6977,7 @@
               </w:rPr>
             </w:pPr>
             <w:bookmarkStart w:id="21" w:name="_Toc117977234"/>
-            <w:bookmarkStart w:id="22" w:name="_Toc118823068"/>
+            <w:bookmarkStart w:id="22" w:name="_Toc118879525"/>
             <w:r>
               <w:rPr>
                 <w:color w:val="000000" w:themeColor="text1"/>
@@ -6744,8 +7198,20 @@
                 <w:color w:val="FFFFFF"/>
                 <w:u w:color="FFFFFF"/>
               </w:rPr>
-              <w:t>Entry Condition</w:t>
-            </w:r>
+              <w:t xml:space="preserve">Entry </w:t>
+            </w:r>
+            <w:proofErr w:type="spellStart"/>
+            <w:r>
+              <w:rPr>
+                <w:rFonts w:ascii="Cambria" w:hAnsi="Cambria"/>
+                <w:b/>
+                <w:bCs/>
+                <w:color w:val="FFFFFF"/>
+                <w:u w:color="FFFFFF"/>
+              </w:rPr>
+              <w:t>Condition</w:t>
+            </w:r>
+            <w:proofErr w:type="spellEnd"/>
           </w:p>
         </w:tc>
         <w:tc>
@@ -7162,7 +7628,29 @@
                 <w:color w:val="FFFFFF"/>
                 <w:u w:color="FFFFFF"/>
               </w:rPr>
-              <w:t>Exit Condition On Success</w:t>
+              <w:t xml:space="preserve">Exit </w:t>
+            </w:r>
+            <w:proofErr w:type="spellStart"/>
+            <w:r>
+              <w:rPr>
+                <w:rFonts w:ascii="Cambria" w:hAnsi="Cambria"/>
+                <w:b/>
+                <w:bCs/>
+                <w:color w:val="FFFFFF"/>
+                <w:u w:color="FFFFFF"/>
+              </w:rPr>
+              <w:t>Condition</w:t>
+            </w:r>
+            <w:proofErr w:type="spellEnd"/>
+            <w:r>
+              <w:rPr>
+                <w:rFonts w:ascii="Cambria" w:hAnsi="Cambria"/>
+                <w:b/>
+                <w:bCs/>
+                <w:color w:val="FFFFFF"/>
+                <w:u w:color="FFFFFF"/>
+              </w:rPr>
+              <w:t xml:space="preserve"> On Success</w:t>
             </w:r>
           </w:p>
         </w:tc>
@@ -7236,8 +7724,20 @@
                 <w:color w:val="FFFFFF"/>
                 <w:u w:color="FFFFFF"/>
               </w:rPr>
-              <w:t>User Priority</w:t>
-            </w:r>
+              <w:t xml:space="preserve">User </w:t>
+            </w:r>
+            <w:proofErr w:type="spellStart"/>
+            <w:r>
+              <w:rPr>
+                <w:rFonts w:ascii="Cambria" w:hAnsi="Cambria"/>
+                <w:b/>
+                <w:bCs/>
+                <w:color w:val="FFFFFF"/>
+                <w:u w:color="FFFFFF"/>
+              </w:rPr>
+              <w:t>Priority</w:t>
+            </w:r>
+            <w:proofErr w:type="spellEnd"/>
           </w:p>
         </w:tc>
         <w:tc>
@@ -7294,7 +7794,7 @@
           <w:szCs w:val="32"/>
         </w:rPr>
       </w:pPr>
-      <w:bookmarkStart w:id="23" w:name="_Toc118823069"/>
+      <w:bookmarkStart w:id="23" w:name="_Toc118879526"/>
       <w:r>
         <w:rPr>
           <w:rStyle w:val="Titolo2Carattere"/>
@@ -7394,7 +7894,7 @@
         </w:rPr>
       </w:pPr>
       <w:bookmarkStart w:id="24" w:name="_Toc117977235"/>
-      <w:bookmarkStart w:id="25" w:name="_Toc118823070"/>
+      <w:bookmarkStart w:id="25" w:name="_Toc118879527"/>
       <w:r>
         <w:rPr>
           <w:rFonts w:ascii="Times New Roman" w:hAnsi="Times New Roman" w:cs="Times New Roman"/>
@@ -7616,7 +8116,7 @@
               </w:rPr>
             </w:pPr>
             <w:bookmarkStart w:id="26" w:name="_Toc117977236"/>
-            <w:bookmarkStart w:id="27" w:name="_Toc118823071"/>
+            <w:bookmarkStart w:id="27" w:name="_Toc118879528"/>
             <w:r>
               <w:rPr>
                 <w:color w:val="000000" w:themeColor="text1"/>
@@ -7836,8 +8336,20 @@
                 <w:color w:val="FFFFFF"/>
                 <w:u w:color="FFFFFF"/>
               </w:rPr>
-              <w:t>Entry Condition</w:t>
-            </w:r>
+              <w:t xml:space="preserve">Entry </w:t>
+            </w:r>
+            <w:proofErr w:type="spellStart"/>
+            <w:r>
+              <w:rPr>
+                <w:rFonts w:ascii="Cambria" w:hAnsi="Cambria"/>
+                <w:b/>
+                <w:bCs/>
+                <w:color w:val="FFFFFF"/>
+                <w:u w:color="FFFFFF"/>
+              </w:rPr>
+              <w:t>Condition</w:t>
+            </w:r>
+            <w:proofErr w:type="spellEnd"/>
           </w:p>
         </w:tc>
         <w:tc>
@@ -8347,7 +8859,29 @@
                 <w:color w:val="FFFFFF"/>
                 <w:u w:color="FFFFFF"/>
               </w:rPr>
-              <w:t>Exit Condition On Success</w:t>
+              <w:t xml:space="preserve">Exit </w:t>
+            </w:r>
+            <w:proofErr w:type="spellStart"/>
+            <w:r>
+              <w:rPr>
+                <w:rFonts w:ascii="Cambria" w:hAnsi="Cambria"/>
+                <w:b/>
+                <w:bCs/>
+                <w:color w:val="FFFFFF"/>
+                <w:u w:color="FFFFFF"/>
+              </w:rPr>
+              <w:t>Condition</w:t>
+            </w:r>
+            <w:proofErr w:type="spellEnd"/>
+            <w:r>
+              <w:rPr>
+                <w:rFonts w:ascii="Cambria" w:hAnsi="Cambria"/>
+                <w:b/>
+                <w:bCs/>
+                <w:color w:val="FFFFFF"/>
+                <w:u w:color="FFFFFF"/>
+              </w:rPr>
+              <w:t xml:space="preserve"> On Success</w:t>
             </w:r>
           </w:p>
         </w:tc>
@@ -8871,8 +9405,20 @@
                 <w:color w:val="FFFFFF"/>
                 <w:u w:color="FFFFFF"/>
               </w:rPr>
-              <w:t>Exit Condition</w:t>
-            </w:r>
+              <w:t xml:space="preserve">Exit </w:t>
+            </w:r>
+            <w:proofErr w:type="spellStart"/>
+            <w:r>
+              <w:rPr>
+                <w:rFonts w:ascii="Cambria" w:hAnsi="Cambria"/>
+                <w:b/>
+                <w:bCs/>
+                <w:color w:val="FFFFFF"/>
+                <w:u w:color="FFFFFF"/>
+              </w:rPr>
+              <w:t>Condition</w:t>
+            </w:r>
+            <w:proofErr w:type="spellEnd"/>
           </w:p>
         </w:tc>
         <w:tc>
@@ -8945,8 +9491,20 @@
                 <w:color w:val="FFFFFF"/>
                 <w:u w:color="FFFFFF"/>
               </w:rPr>
-              <w:t>User Priority</w:t>
-            </w:r>
+              <w:t xml:space="preserve">User </w:t>
+            </w:r>
+            <w:proofErr w:type="spellStart"/>
+            <w:r>
+              <w:rPr>
+                <w:rFonts w:ascii="Cambria" w:hAnsi="Cambria"/>
+                <w:b/>
+                <w:bCs/>
+                <w:color w:val="FFFFFF"/>
+                <w:u w:color="FFFFFF"/>
+              </w:rPr>
+              <w:t>Priority</w:t>
+            </w:r>
+            <w:proofErr w:type="spellEnd"/>
           </w:p>
         </w:tc>
         <w:tc>
@@ -9028,7 +9586,7 @@
         </w:rPr>
       </w:pPr>
       <w:bookmarkStart w:id="28" w:name="_Toc117977237"/>
-      <w:bookmarkStart w:id="29" w:name="_Toc118823072"/>
+      <w:bookmarkStart w:id="29" w:name="_Toc118879529"/>
       <w:r>
         <w:rPr>
           <w:rFonts w:ascii="Times New Roman" w:hAnsi="Times New Roman" w:cs="Times New Roman"/>
@@ -9109,7 +9667,7 @@
           <w:szCs w:val="32"/>
         </w:rPr>
       </w:pPr>
-      <w:bookmarkStart w:id="30" w:name="_Toc118823073"/>
+      <w:bookmarkStart w:id="30" w:name="_Toc118879530"/>
       <w:r>
         <w:rPr>
           <w:rFonts w:ascii="Times New Roman" w:hAnsi="Times New Roman" w:cs="Times New Roman"/>
@@ -9190,7 +9748,7 @@
           <w:szCs w:val="32"/>
         </w:rPr>
       </w:pPr>
-      <w:bookmarkStart w:id="31" w:name="_Toc118823074"/>
+      <w:bookmarkStart w:id="31" w:name="_Toc118879531"/>
       <w:r>
         <w:rPr>
           <w:rFonts w:ascii="Times New Roman" w:hAnsi="Times New Roman" w:cs="Times New Roman"/>
@@ -9377,7 +9935,7 @@
               </w:rPr>
             </w:pPr>
             <w:bookmarkStart w:id="32" w:name="_Toc117977238"/>
-            <w:bookmarkStart w:id="33" w:name="_Toc118823075"/>
+            <w:bookmarkStart w:id="33" w:name="_Toc118879532"/>
             <w:r>
               <w:rPr>
                 <w:color w:val="000000" w:themeColor="text1"/>
@@ -9597,8 +10155,20 @@
                 <w:color w:val="FFFFFF"/>
                 <w:u w:color="FFFFFF"/>
               </w:rPr>
-              <w:t>Entry Condition</w:t>
-            </w:r>
+              <w:t xml:space="preserve">Entry </w:t>
+            </w:r>
+            <w:proofErr w:type="spellStart"/>
+            <w:r>
+              <w:rPr>
+                <w:rFonts w:ascii="Cambria" w:hAnsi="Cambria"/>
+                <w:b/>
+                <w:bCs/>
+                <w:color w:val="FFFFFF"/>
+                <w:u w:color="FFFFFF"/>
+              </w:rPr>
+              <w:t>Condition</w:t>
+            </w:r>
+            <w:proofErr w:type="spellEnd"/>
           </w:p>
         </w:tc>
         <w:tc>
@@ -9879,7 +10449,25 @@
                 <w:sz w:val="22"/>
                 <w:szCs w:val="22"/>
               </w:rPr>
-              <w:t xml:space="preserve"> nell’apposito form e le invia al sistema.</w:t>
+              <w:t xml:space="preserve"> nell’apposito </w:t>
+            </w:r>
+            <w:proofErr w:type="spellStart"/>
+            <w:r>
+              <w:rPr>
+                <w:rFonts w:ascii="Calibri Light" w:hAnsi="Calibri Light"/>
+                <w:sz w:val="22"/>
+                <w:szCs w:val="22"/>
+              </w:rPr>
+              <w:t>form</w:t>
+            </w:r>
+            <w:proofErr w:type="spellEnd"/>
+            <w:r>
+              <w:rPr>
+                <w:rFonts w:ascii="Calibri Light" w:hAnsi="Calibri Light"/>
+                <w:sz w:val="22"/>
+                <w:szCs w:val="22"/>
+              </w:rPr>
+              <w:t xml:space="preserve"> e le invia al sistema.</w:t>
             </w:r>
           </w:p>
           <w:p>
@@ -10081,7 +10669,29 @@
                 <w:color w:val="FFFFFF"/>
                 <w:u w:color="FFFFFF"/>
               </w:rPr>
-              <w:t>Exit Condition On Success</w:t>
+              <w:t xml:space="preserve">Exit </w:t>
+            </w:r>
+            <w:proofErr w:type="spellStart"/>
+            <w:r>
+              <w:rPr>
+                <w:rFonts w:ascii="Cambria" w:hAnsi="Cambria"/>
+                <w:b/>
+                <w:bCs/>
+                <w:color w:val="FFFFFF"/>
+                <w:u w:color="FFFFFF"/>
+              </w:rPr>
+              <w:t>Condition</w:t>
+            </w:r>
+            <w:proofErr w:type="spellEnd"/>
+            <w:r>
+              <w:rPr>
+                <w:rFonts w:ascii="Cambria" w:hAnsi="Cambria"/>
+                <w:b/>
+                <w:bCs/>
+                <w:color w:val="FFFFFF"/>
+                <w:u w:color="FFFFFF"/>
+              </w:rPr>
+              <w:t xml:space="preserve"> On Success</w:t>
             </w:r>
           </w:p>
         </w:tc>
@@ -10189,7 +10799,25 @@
                 <w:sz w:val="22"/>
                 <w:szCs w:val="22"/>
               </w:rPr>
-              <w:t xml:space="preserve">L’utente, in fase di compilazione del form, inserisce credenziali </w:t>
+              <w:t xml:space="preserve">L’utente, in fase di compilazione del </w:t>
+            </w:r>
+            <w:proofErr w:type="spellStart"/>
+            <w:r>
+              <w:rPr>
+                <w:rFonts w:ascii="Calibri Light" w:hAnsi="Calibri Light"/>
+                <w:sz w:val="22"/>
+                <w:szCs w:val="22"/>
+              </w:rPr>
+              <w:t>form</w:t>
+            </w:r>
+            <w:proofErr w:type="spellEnd"/>
+            <w:r>
+              <w:rPr>
+                <w:rFonts w:ascii="Calibri Light" w:hAnsi="Calibri Light"/>
+                <w:sz w:val="22"/>
+                <w:szCs w:val="22"/>
+              </w:rPr>
+              <w:t xml:space="preserve">, inserisce credenziali </w:t>
             </w:r>
             <w:r>
               <w:rPr>
@@ -10370,7 +10998,25 @@
                 <w:sz w:val="22"/>
                 <w:szCs w:val="22"/>
               </w:rPr>
-              <w:t xml:space="preserve"> form e le invia al sistema.</w:t>
+              <w:t xml:space="preserve"> </w:t>
+            </w:r>
+            <w:proofErr w:type="spellStart"/>
+            <w:r>
+              <w:rPr>
+                <w:rFonts w:ascii="Calibri Light" w:hAnsi="Calibri Light"/>
+                <w:sz w:val="22"/>
+                <w:szCs w:val="22"/>
+              </w:rPr>
+              <w:t>form</w:t>
+            </w:r>
+            <w:proofErr w:type="spellEnd"/>
+            <w:r>
+              <w:rPr>
+                <w:rFonts w:ascii="Calibri Light" w:hAnsi="Calibri Light"/>
+                <w:sz w:val="22"/>
+                <w:szCs w:val="22"/>
+              </w:rPr>
+              <w:t xml:space="preserve"> e le invia al sistema.</w:t>
             </w:r>
           </w:p>
           <w:p>
@@ -10662,8 +11308,42 @@
                 <w:color w:val="FFFFFF"/>
                 <w:u w:color="FFFFFF"/>
               </w:rPr>
-              <w:t>Exit Condition On Failure</w:t>
-            </w:r>
+              <w:t xml:space="preserve">Exit </w:t>
+            </w:r>
+            <w:proofErr w:type="spellStart"/>
+            <w:r>
+              <w:rPr>
+                <w:rFonts w:ascii="Cambria" w:hAnsi="Cambria"/>
+                <w:b/>
+                <w:bCs/>
+                <w:color w:val="FFFFFF"/>
+                <w:u w:color="FFFFFF"/>
+              </w:rPr>
+              <w:t>Condition</w:t>
+            </w:r>
+            <w:proofErr w:type="spellEnd"/>
+            <w:r>
+              <w:rPr>
+                <w:rFonts w:ascii="Cambria" w:hAnsi="Cambria"/>
+                <w:b/>
+                <w:bCs/>
+                <w:color w:val="FFFFFF"/>
+                <w:u w:color="FFFFFF"/>
+              </w:rPr>
+              <w:t xml:space="preserve"> On </w:t>
+            </w:r>
+            <w:proofErr w:type="spellStart"/>
+            <w:r>
+              <w:rPr>
+                <w:rFonts w:ascii="Cambria" w:hAnsi="Cambria"/>
+                <w:b/>
+                <w:bCs/>
+                <w:color w:val="FFFFFF"/>
+                <w:u w:color="FFFFFF"/>
+              </w:rPr>
+              <w:t>Failure</w:t>
+            </w:r>
+            <w:proofErr w:type="spellEnd"/>
           </w:p>
         </w:tc>
         <w:tc>
@@ -10736,8 +11416,20 @@
                 <w:color w:val="FFFFFF"/>
                 <w:u w:color="FFFFFF"/>
               </w:rPr>
-              <w:t>User Priority</w:t>
-            </w:r>
+              <w:t xml:space="preserve">User </w:t>
+            </w:r>
+            <w:proofErr w:type="spellStart"/>
+            <w:r>
+              <w:rPr>
+                <w:rFonts w:ascii="Cambria" w:hAnsi="Cambria"/>
+                <w:b/>
+                <w:bCs/>
+                <w:color w:val="FFFFFF"/>
+                <w:u w:color="FFFFFF"/>
+              </w:rPr>
+              <w:t>Priority</w:t>
+            </w:r>
+            <w:proofErr w:type="spellEnd"/>
           </w:p>
         </w:tc>
         <w:tc>
@@ -10798,7 +11490,7 @@
         </w:rPr>
       </w:pPr>
       <w:bookmarkStart w:id="34" w:name="_Toc117977239"/>
-      <w:bookmarkStart w:id="35" w:name="_Toc118823076"/>
+      <w:bookmarkStart w:id="35" w:name="_Toc118879533"/>
       <w:r>
         <w:rPr>
           <w:rFonts w:ascii="Times New Roman" w:hAnsi="Times New Roman" w:cs="Times New Roman"/>
@@ -10879,7 +11571,7 @@
           <w:szCs w:val="32"/>
         </w:rPr>
       </w:pPr>
-      <w:bookmarkStart w:id="36" w:name="_Toc118823077"/>
+      <w:bookmarkStart w:id="36" w:name="_Toc118879534"/>
       <w:r>
         <w:rPr>
           <w:rFonts w:ascii="Times New Roman" w:hAnsi="Times New Roman" w:cs="Times New Roman"/>
@@ -10960,7 +11652,7 @@
           <w:szCs w:val="32"/>
         </w:rPr>
       </w:pPr>
-      <w:bookmarkStart w:id="37" w:name="_Toc118823078"/>
+      <w:bookmarkStart w:id="37" w:name="_Toc118879535"/>
       <w:r>
         <w:rPr>
           <w:rFonts w:ascii="Times New Roman" w:hAnsi="Times New Roman" w:cs="Times New Roman"/>
@@ -11131,7 +11823,7 @@
               </w:rPr>
             </w:pPr>
             <w:bookmarkStart w:id="38" w:name="_Toc117977240"/>
-            <w:bookmarkStart w:id="39" w:name="_Toc118823079"/>
+            <w:bookmarkStart w:id="39" w:name="_Toc118879536"/>
             <w:r>
               <w:rPr>
                 <w:color w:val="000000" w:themeColor="text1"/>
@@ -11354,8 +12046,20 @@
                 <w:color w:val="FFFFFF"/>
                 <w:u w:color="FFFFFF"/>
               </w:rPr>
-              <w:t>Entry Condition</w:t>
-            </w:r>
+              <w:t xml:space="preserve">Entry </w:t>
+            </w:r>
+            <w:proofErr w:type="spellStart"/>
+            <w:r>
+              <w:rPr>
+                <w:rFonts w:ascii="Cambria" w:hAnsi="Cambria"/>
+                <w:b/>
+                <w:bCs/>
+                <w:color w:val="FFFFFF"/>
+                <w:u w:color="FFFFFF"/>
+              </w:rPr>
+              <w:t>Condition</w:t>
+            </w:r>
+            <w:proofErr w:type="spellEnd"/>
           </w:p>
         </w:tc>
         <w:tc>
@@ -11783,7 +12487,29 @@
                 <w:color w:val="FFFFFF"/>
                 <w:u w:color="FFFFFF"/>
               </w:rPr>
-              <w:t>Exit Condition On Success</w:t>
+              <w:t xml:space="preserve">Exit </w:t>
+            </w:r>
+            <w:proofErr w:type="spellStart"/>
+            <w:r>
+              <w:rPr>
+                <w:rFonts w:ascii="Cambria" w:hAnsi="Cambria"/>
+                <w:b/>
+                <w:bCs/>
+                <w:color w:val="FFFFFF"/>
+                <w:u w:color="FFFFFF"/>
+              </w:rPr>
+              <w:t>Condition</w:t>
+            </w:r>
+            <w:proofErr w:type="spellEnd"/>
+            <w:r>
+              <w:rPr>
+                <w:rFonts w:ascii="Cambria" w:hAnsi="Cambria"/>
+                <w:b/>
+                <w:bCs/>
+                <w:color w:val="FFFFFF"/>
+                <w:u w:color="FFFFFF"/>
+              </w:rPr>
+              <w:t xml:space="preserve"> On Success</w:t>
             </w:r>
           </w:p>
         </w:tc>
@@ -11858,8 +12584,20 @@
                 <w:color w:val="FFFFFF"/>
                 <w:u w:color="FFFFFF"/>
               </w:rPr>
-              <w:t>User Priority</w:t>
-            </w:r>
+              <w:t xml:space="preserve">User </w:t>
+            </w:r>
+            <w:proofErr w:type="spellStart"/>
+            <w:r>
+              <w:rPr>
+                <w:rFonts w:ascii="Cambria" w:hAnsi="Cambria"/>
+                <w:b/>
+                <w:bCs/>
+                <w:color w:val="FFFFFF"/>
+                <w:u w:color="FFFFFF"/>
+              </w:rPr>
+              <w:t>Priority</w:t>
+            </w:r>
+            <w:proofErr w:type="spellEnd"/>
           </w:p>
         </w:tc>
         <w:tc>
@@ -11920,7 +12658,7 @@
         </w:rPr>
       </w:pPr>
       <w:bookmarkStart w:id="40" w:name="_Toc117977241"/>
-      <w:bookmarkStart w:id="41" w:name="_Toc118823080"/>
+      <w:bookmarkStart w:id="41" w:name="_Toc118879537"/>
       <w:r>
         <w:rPr>
           <w:rFonts w:ascii="Times New Roman" w:hAnsi="Times New Roman" w:cs="Times New Roman"/>
@@ -12005,7 +12743,7 @@
           <w:szCs w:val="32"/>
         </w:rPr>
       </w:pPr>
-      <w:bookmarkStart w:id="42" w:name="_Toc118823081"/>
+      <w:bookmarkStart w:id="42" w:name="_Toc118879538"/>
       <w:r>
         <w:rPr>
           <w:rFonts w:ascii="Times New Roman" w:hAnsi="Times New Roman" w:cs="Times New Roman"/>
@@ -12171,7 +12909,7 @@
               <w:jc w:val="center"/>
             </w:pPr>
             <w:bookmarkStart w:id="43" w:name="_Toc117977242"/>
-            <w:bookmarkStart w:id="44" w:name="_Toc118823082"/>
+            <w:bookmarkStart w:id="44" w:name="_Toc118879539"/>
             <w:r>
               <w:rPr>
                 <w:rStyle w:val="Titolo3Carattere"/>
@@ -12401,8 +13139,20 @@
                 <w:color w:val="FFFFFF"/>
                 <w:u w:color="FFFFFF"/>
               </w:rPr>
-              <w:t>Entry Condition</w:t>
-            </w:r>
+              <w:t xml:space="preserve">Entry </w:t>
+            </w:r>
+            <w:proofErr w:type="spellStart"/>
+            <w:r>
+              <w:rPr>
+                <w:rFonts w:ascii="Cambria" w:hAnsi="Cambria"/>
+                <w:b/>
+                <w:bCs/>
+                <w:color w:val="FFFFFF"/>
+                <w:u w:color="FFFFFF"/>
+              </w:rPr>
+              <w:t>Condition</w:t>
+            </w:r>
+            <w:proofErr w:type="spellEnd"/>
           </w:p>
         </w:tc>
         <w:tc>
@@ -12977,7 +13727,29 @@
                 <w:color w:val="FFFFFF"/>
                 <w:u w:color="FFFFFF"/>
               </w:rPr>
-              <w:t>Exit Condition On Success</w:t>
+              <w:t xml:space="preserve">Exit </w:t>
+            </w:r>
+            <w:proofErr w:type="spellStart"/>
+            <w:r>
+              <w:rPr>
+                <w:rFonts w:ascii="Cambria" w:hAnsi="Cambria"/>
+                <w:b/>
+                <w:bCs/>
+                <w:color w:val="FFFFFF"/>
+                <w:u w:color="FFFFFF"/>
+              </w:rPr>
+              <w:t>Condition</w:t>
+            </w:r>
+            <w:proofErr w:type="spellEnd"/>
+            <w:r>
+              <w:rPr>
+                <w:rFonts w:ascii="Cambria" w:hAnsi="Cambria"/>
+                <w:b/>
+                <w:bCs/>
+                <w:color w:val="FFFFFF"/>
+                <w:u w:color="FFFFFF"/>
+              </w:rPr>
+              <w:t xml:space="preserve"> On Success</w:t>
             </w:r>
           </w:p>
         </w:tc>
@@ -13125,8 +13897,20 @@
                 <w:color w:val="FFFFFF"/>
                 <w:u w:color="FFFFFF"/>
               </w:rPr>
-              <w:t>User Priority</w:t>
-            </w:r>
+              <w:t xml:space="preserve">User </w:t>
+            </w:r>
+            <w:proofErr w:type="spellStart"/>
+            <w:r>
+              <w:rPr>
+                <w:rFonts w:ascii="Cambria" w:hAnsi="Cambria"/>
+                <w:b/>
+                <w:bCs/>
+                <w:color w:val="FFFFFF"/>
+                <w:u w:color="FFFFFF"/>
+              </w:rPr>
+              <w:t>Priority</w:t>
+            </w:r>
+            <w:proofErr w:type="spellEnd"/>
           </w:p>
         </w:tc>
         <w:tc>
@@ -13205,7 +13989,7 @@
         </w:rPr>
       </w:pPr>
       <w:bookmarkStart w:id="45" w:name="_Toc117977243"/>
-      <w:bookmarkStart w:id="46" w:name="_Toc118823083"/>
+      <w:bookmarkStart w:id="46" w:name="_Toc118879540"/>
       <w:r>
         <w:rPr>
           <w:rFonts w:ascii="Times New Roman" w:hAnsi="Times New Roman" w:cs="Times New Roman"/>
@@ -13290,7 +14074,7 @@
           <w:szCs w:val="32"/>
         </w:rPr>
       </w:pPr>
-      <w:bookmarkStart w:id="47" w:name="_Toc118823084"/>
+      <w:bookmarkStart w:id="47" w:name="_Toc118879541"/>
       <w:r>
         <w:rPr>
           <w:rFonts w:ascii="Times New Roman" w:hAnsi="Times New Roman" w:cs="Times New Roman"/>
@@ -13452,7 +14236,7 @@
               </w:rPr>
             </w:pPr>
             <w:bookmarkStart w:id="48" w:name="_Toc117977244"/>
-            <w:bookmarkStart w:id="49" w:name="_Toc118823085"/>
+            <w:bookmarkStart w:id="49" w:name="_Toc118879542"/>
             <w:r>
               <w:rPr>
                 <w:color w:val="000000" w:themeColor="text1"/>
@@ -13675,8 +14459,20 @@
                 <w:color w:val="FFFFFF"/>
                 <w:u w:color="FFFFFF"/>
               </w:rPr>
-              <w:t>Entry Condition</w:t>
-            </w:r>
+              <w:t xml:space="preserve">Entry </w:t>
+            </w:r>
+            <w:proofErr w:type="spellStart"/>
+            <w:r>
+              <w:rPr>
+                <w:rFonts w:ascii="Cambria" w:hAnsi="Cambria"/>
+                <w:b/>
+                <w:bCs/>
+                <w:color w:val="FFFFFF"/>
+                <w:u w:color="FFFFFF"/>
+              </w:rPr>
+              <w:t>Condition</w:t>
+            </w:r>
+            <w:proofErr w:type="spellEnd"/>
           </w:p>
         </w:tc>
         <w:tc>
@@ -14238,7 +15034,25 @@
                 <w:sz w:val="22"/>
                 <w:szCs w:val="22"/>
               </w:rPr>
-              <w:t xml:space="preserve">Carta di credito: il sistema mostra un form </w:t>
+              <w:t xml:space="preserve">Carta di credito: il sistema mostra un </w:t>
+            </w:r>
+            <w:proofErr w:type="spellStart"/>
+            <w:r>
+              <w:rPr>
+                <w:rFonts w:ascii="Calibri Light" w:hAnsi="Calibri Light"/>
+                <w:sz w:val="22"/>
+                <w:szCs w:val="22"/>
+              </w:rPr>
+              <w:t>form</w:t>
+            </w:r>
+            <w:proofErr w:type="spellEnd"/>
+            <w:r>
+              <w:rPr>
+                <w:rFonts w:ascii="Calibri Light" w:hAnsi="Calibri Light"/>
+                <w:sz w:val="22"/>
+                <w:szCs w:val="22"/>
+              </w:rPr>
+              <w:t xml:space="preserve"> </w:t>
             </w:r>
             <w:r>
               <w:rPr>
@@ -14378,7 +15192,29 @@
                 <w:color w:val="FFFFFF"/>
                 <w:u w:color="FFFFFF"/>
               </w:rPr>
-              <w:t>Exit Condition On Success</w:t>
+              <w:t xml:space="preserve">Exit </w:t>
+            </w:r>
+            <w:proofErr w:type="spellStart"/>
+            <w:r>
+              <w:rPr>
+                <w:rFonts w:ascii="Cambria" w:hAnsi="Cambria"/>
+                <w:b/>
+                <w:bCs/>
+                <w:color w:val="FFFFFF"/>
+                <w:u w:color="FFFFFF"/>
+              </w:rPr>
+              <w:t>Condition</w:t>
+            </w:r>
+            <w:proofErr w:type="spellEnd"/>
+            <w:r>
+              <w:rPr>
+                <w:rFonts w:ascii="Cambria" w:hAnsi="Cambria"/>
+                <w:b/>
+                <w:bCs/>
+                <w:color w:val="FFFFFF"/>
+                <w:u w:color="FFFFFF"/>
+              </w:rPr>
+              <w:t xml:space="preserve"> On Success</w:t>
             </w:r>
           </w:p>
         </w:tc>
@@ -14454,8 +15290,20 @@
                 <w:u w:color="FFFFFF"/>
               </w:rPr>
               <w:lastRenderedPageBreak/>
-              <w:t>User Priority</w:t>
-            </w:r>
+              <w:t xml:space="preserve">User </w:t>
+            </w:r>
+            <w:proofErr w:type="spellStart"/>
+            <w:r>
+              <w:rPr>
+                <w:rFonts w:ascii="Cambria" w:hAnsi="Cambria"/>
+                <w:b/>
+                <w:bCs/>
+                <w:color w:val="FFFFFF"/>
+                <w:u w:color="FFFFFF"/>
+              </w:rPr>
+              <w:t>Priority</w:t>
+            </w:r>
+            <w:proofErr w:type="spellEnd"/>
           </w:p>
         </w:tc>
         <w:tc>
@@ -14506,7 +15354,7 @@
           <w:szCs w:val="32"/>
         </w:rPr>
       </w:pPr>
-      <w:bookmarkStart w:id="50" w:name="_Toc118823086"/>
+      <w:bookmarkStart w:id="50" w:name="_Toc118879543"/>
       <w:r>
         <w:rPr>
           <w:rFonts w:ascii="Times New Roman" w:hAnsi="Times New Roman" w:cs="Times New Roman"/>
@@ -14876,7 +15724,7 @@
         </w:rPr>
       </w:pPr>
       <w:bookmarkStart w:id="51" w:name="_Toc117977245"/>
-      <w:bookmarkStart w:id="52" w:name="_Toc118823087"/>
+      <w:bookmarkStart w:id="52" w:name="_Toc118879544"/>
       <w:r>
         <w:rPr>
           <w:rFonts w:ascii="Times New Roman" w:hAnsi="Times New Roman" w:cs="Times New Roman"/>
@@ -15065,7 +15913,7 @@
               </w:rPr>
             </w:pPr>
             <w:bookmarkStart w:id="53" w:name="_Toc117977246"/>
-            <w:bookmarkStart w:id="54" w:name="_Toc118823088"/>
+            <w:bookmarkStart w:id="54" w:name="_Toc118879545"/>
             <w:r>
               <w:rPr>
                 <w:rFonts w:ascii="Carlito" w:hAnsi="Carlito"/>
@@ -15296,8 +16144,20 @@
                 <w:color w:val="FFFFFF"/>
                 <w:u w:color="FFFFFF"/>
               </w:rPr>
-              <w:t>Entry Condition</w:t>
-            </w:r>
+              <w:t xml:space="preserve">Entry </w:t>
+            </w:r>
+            <w:proofErr w:type="spellStart"/>
+            <w:r>
+              <w:rPr>
+                <w:rFonts w:ascii="Cambria" w:hAnsi="Cambria"/>
+                <w:b/>
+                <w:bCs/>
+                <w:color w:val="FFFFFF"/>
+                <w:u w:color="FFFFFF"/>
+              </w:rPr>
+              <w:t>Condition</w:t>
+            </w:r>
+            <w:proofErr w:type="spellEnd"/>
           </w:p>
         </w:tc>
         <w:tc>
@@ -15708,7 +16568,29 @@
                 <w:color w:val="FFFFFF"/>
                 <w:u w:color="FFFFFF"/>
               </w:rPr>
-              <w:t>Exit Condition On Success</w:t>
+              <w:t xml:space="preserve">Exit </w:t>
+            </w:r>
+            <w:proofErr w:type="spellStart"/>
+            <w:r>
+              <w:rPr>
+                <w:rFonts w:ascii="Cambria" w:hAnsi="Cambria"/>
+                <w:b/>
+                <w:bCs/>
+                <w:color w:val="FFFFFF"/>
+                <w:u w:color="FFFFFF"/>
+              </w:rPr>
+              <w:t>Condition</w:t>
+            </w:r>
+            <w:proofErr w:type="spellEnd"/>
+            <w:r>
+              <w:rPr>
+                <w:rFonts w:ascii="Cambria" w:hAnsi="Cambria"/>
+                <w:b/>
+                <w:bCs/>
+                <w:color w:val="FFFFFF"/>
+                <w:u w:color="FFFFFF"/>
+              </w:rPr>
+              <w:t xml:space="preserve"> On Success</w:t>
             </w:r>
           </w:p>
         </w:tc>
@@ -15783,8 +16665,20 @@
                 <w:color w:val="FFFFFF"/>
                 <w:u w:color="FFFFFF"/>
               </w:rPr>
-              <w:t>User Priority</w:t>
-            </w:r>
+              <w:t xml:space="preserve">User </w:t>
+            </w:r>
+            <w:proofErr w:type="spellStart"/>
+            <w:r>
+              <w:rPr>
+                <w:rFonts w:ascii="Cambria" w:hAnsi="Cambria"/>
+                <w:b/>
+                <w:bCs/>
+                <w:color w:val="FFFFFF"/>
+                <w:u w:color="FFFFFF"/>
+              </w:rPr>
+              <w:t>Priority</w:t>
+            </w:r>
+            <w:proofErr w:type="spellEnd"/>
           </w:p>
         </w:tc>
         <w:tc>
@@ -15836,7 +16730,7 @@
         </w:rPr>
       </w:pPr>
       <w:bookmarkStart w:id="55" w:name="_Toc117977247"/>
-      <w:bookmarkStart w:id="56" w:name="_Toc118823089"/>
+      <w:bookmarkStart w:id="56" w:name="_Toc118879546"/>
       <w:r>
         <w:rPr>
           <w:rFonts w:ascii="Times New Roman" w:hAnsi="Times New Roman" w:cs="Times New Roman"/>
@@ -15917,7 +16811,7 @@
           <w:szCs w:val="32"/>
         </w:rPr>
       </w:pPr>
-      <w:bookmarkStart w:id="57" w:name="_Toc118823090"/>
+      <w:bookmarkStart w:id="57" w:name="_Toc118879547"/>
       <w:r>
         <w:rPr>
           <w:rFonts w:ascii="Times New Roman" w:hAnsi="Times New Roman" w:cs="Times New Roman"/>
@@ -16102,7 +16996,7 @@
               <w:jc w:val="center"/>
             </w:pPr>
             <w:bookmarkStart w:id="58" w:name="_Toc117977248"/>
-            <w:bookmarkStart w:id="59" w:name="_Toc118823091"/>
+            <w:bookmarkStart w:id="59" w:name="_Toc118879548"/>
             <w:r>
               <w:rPr>
                 <w:rStyle w:val="Titolo3Carattere"/>
@@ -16310,8 +17204,20 @@
                 <w:color w:val="FFFFFF"/>
                 <w:u w:color="FFFFFF"/>
               </w:rPr>
-              <w:t>Entry Condition</w:t>
-            </w:r>
+              <w:t xml:space="preserve">Entry </w:t>
+            </w:r>
+            <w:proofErr w:type="spellStart"/>
+            <w:r>
+              <w:rPr>
+                <w:rFonts w:ascii="Cambria" w:hAnsi="Cambria"/>
+                <w:b/>
+                <w:bCs/>
+                <w:color w:val="FFFFFF"/>
+                <w:u w:color="FFFFFF"/>
+              </w:rPr>
+              <w:t>Condition</w:t>
+            </w:r>
+            <w:proofErr w:type="spellEnd"/>
           </w:p>
         </w:tc>
         <w:tc>
@@ -16645,7 +17551,29 @@
                 <w:color w:val="FFFFFF"/>
                 <w:u w:color="FFFFFF"/>
               </w:rPr>
-              <w:t>Exit Condition On Success</w:t>
+              <w:t xml:space="preserve">Exit </w:t>
+            </w:r>
+            <w:proofErr w:type="spellStart"/>
+            <w:r>
+              <w:rPr>
+                <w:rFonts w:ascii="Cambria" w:hAnsi="Cambria"/>
+                <w:b/>
+                <w:bCs/>
+                <w:color w:val="FFFFFF"/>
+                <w:u w:color="FFFFFF"/>
+              </w:rPr>
+              <w:t>Condition</w:t>
+            </w:r>
+            <w:proofErr w:type="spellEnd"/>
+            <w:r>
+              <w:rPr>
+                <w:rFonts w:ascii="Cambria" w:hAnsi="Cambria"/>
+                <w:b/>
+                <w:bCs/>
+                <w:color w:val="FFFFFF"/>
+                <w:u w:color="FFFFFF"/>
+              </w:rPr>
+              <w:t xml:space="preserve"> On Success</w:t>
             </w:r>
           </w:p>
         </w:tc>
@@ -16793,8 +17721,20 @@
                 <w:color w:val="FFFFFF"/>
                 <w:u w:color="FFFFFF"/>
               </w:rPr>
-              <w:t>User Priority</w:t>
-            </w:r>
+              <w:t xml:space="preserve">User </w:t>
+            </w:r>
+            <w:proofErr w:type="spellStart"/>
+            <w:r>
+              <w:rPr>
+                <w:rFonts w:ascii="Cambria" w:hAnsi="Cambria"/>
+                <w:b/>
+                <w:bCs/>
+                <w:color w:val="FFFFFF"/>
+                <w:u w:color="FFFFFF"/>
+              </w:rPr>
+              <w:t>Priority</w:t>
+            </w:r>
+            <w:proofErr w:type="spellEnd"/>
           </w:p>
         </w:tc>
         <w:tc>
@@ -16854,7 +17794,7 @@
           <w:szCs w:val="32"/>
         </w:rPr>
       </w:pPr>
-      <w:bookmarkStart w:id="60" w:name="_Toc118823092"/>
+      <w:bookmarkStart w:id="60" w:name="_Toc118879549"/>
       <w:r>
         <w:rPr>
           <w:rFonts w:ascii="Times New Roman" w:hAnsi="Times New Roman" w:cs="Times New Roman"/>
@@ -16967,7 +17907,7 @@
           <w:szCs w:val="32"/>
         </w:rPr>
       </w:pPr>
-      <w:bookmarkStart w:id="61" w:name="_Toc118823093"/>
+      <w:bookmarkStart w:id="61" w:name="_Toc118879550"/>
       <w:r>
         <w:rPr>
           <w:rFonts w:ascii="Times New Roman" w:hAnsi="Times New Roman" w:cs="Times New Roman"/>
@@ -17107,7 +18047,7 @@
         </w:rPr>
       </w:pPr>
       <w:bookmarkStart w:id="62" w:name="_Toc117977249"/>
-      <w:bookmarkStart w:id="63" w:name="_Toc118823094"/>
+      <w:bookmarkStart w:id="63" w:name="_Toc118879551"/>
       <w:r>
         <w:rPr>
           <w:rFonts w:ascii="Times New Roman" w:hAnsi="Times New Roman" w:cs="Times New Roman"/>
@@ -17288,7 +18228,7 @@
               </w:rPr>
             </w:pPr>
             <w:bookmarkStart w:id="64" w:name="_Toc117977250"/>
-            <w:bookmarkStart w:id="65" w:name="_Toc118823095"/>
+            <w:bookmarkStart w:id="65" w:name="_Toc118879552"/>
             <w:r>
               <w:rPr>
                 <w:color w:val="000000" w:themeColor="text1"/>
@@ -17486,8 +18426,20 @@
                 <w:color w:val="FFFFFF"/>
                 <w:u w:color="FFFFFF"/>
               </w:rPr>
-              <w:t>Entry Condition</w:t>
-            </w:r>
+              <w:t xml:space="preserve">Entry </w:t>
+            </w:r>
+            <w:proofErr w:type="spellStart"/>
+            <w:r>
+              <w:rPr>
+                <w:rFonts w:ascii="Cambria" w:hAnsi="Cambria"/>
+                <w:b/>
+                <w:bCs/>
+                <w:color w:val="FFFFFF"/>
+                <w:u w:color="FFFFFF"/>
+              </w:rPr>
+              <w:t>Condition</w:t>
+            </w:r>
+            <w:proofErr w:type="spellEnd"/>
           </w:p>
         </w:tc>
         <w:tc>
@@ -17894,7 +18846,29 @@
                 <w:color w:val="FFFFFF"/>
                 <w:u w:color="FFFFFF"/>
               </w:rPr>
-              <w:t>Exit Condition On Success</w:t>
+              <w:t xml:space="preserve">Exit </w:t>
+            </w:r>
+            <w:proofErr w:type="spellStart"/>
+            <w:r>
+              <w:rPr>
+                <w:rFonts w:ascii="Cambria" w:hAnsi="Cambria"/>
+                <w:b/>
+                <w:bCs/>
+                <w:color w:val="FFFFFF"/>
+                <w:u w:color="FFFFFF"/>
+              </w:rPr>
+              <w:t>Condition</w:t>
+            </w:r>
+            <w:proofErr w:type="spellEnd"/>
+            <w:r>
+              <w:rPr>
+                <w:rFonts w:ascii="Cambria" w:hAnsi="Cambria"/>
+                <w:b/>
+                <w:bCs/>
+                <w:color w:val="FFFFFF"/>
+                <w:u w:color="FFFFFF"/>
+              </w:rPr>
+              <w:t xml:space="preserve"> On Success</w:t>
             </w:r>
           </w:p>
         </w:tc>
@@ -17968,8 +18942,20 @@
                 <w:color w:val="FFFFFF"/>
                 <w:u w:color="FFFFFF"/>
               </w:rPr>
-              <w:t>User Priority</w:t>
-            </w:r>
+              <w:t xml:space="preserve">User </w:t>
+            </w:r>
+            <w:proofErr w:type="spellStart"/>
+            <w:r>
+              <w:rPr>
+                <w:rFonts w:ascii="Cambria" w:hAnsi="Cambria"/>
+                <w:b/>
+                <w:bCs/>
+                <w:color w:val="FFFFFF"/>
+                <w:u w:color="FFFFFF"/>
+              </w:rPr>
+              <w:t>Priority</w:t>
+            </w:r>
+            <w:proofErr w:type="spellEnd"/>
           </w:p>
         </w:tc>
         <w:tc>
@@ -18029,7 +19015,7 @@
           <w:szCs w:val="32"/>
         </w:rPr>
       </w:pPr>
-      <w:bookmarkStart w:id="66" w:name="_Toc118823096"/>
+      <w:bookmarkStart w:id="66" w:name="_Toc118879553"/>
       <w:r>
         <w:rPr>
           <w:rFonts w:ascii="Times New Roman" w:hAnsi="Times New Roman" w:cs="Times New Roman"/>
@@ -18169,7 +19155,7 @@
         </w:rPr>
       </w:pPr>
       <w:bookmarkStart w:id="67" w:name="_Toc117977251"/>
-      <w:bookmarkStart w:id="68" w:name="_Toc118823097"/>
+      <w:bookmarkStart w:id="68" w:name="_Toc118879554"/>
       <w:r>
         <w:rPr>
           <w:rFonts w:ascii="Times New Roman" w:hAnsi="Times New Roman" w:cs="Times New Roman"/>
@@ -18360,7 +19346,7 @@
               </w:rPr>
             </w:pPr>
             <w:bookmarkStart w:id="69" w:name="_Toc117977252"/>
-            <w:bookmarkStart w:id="70" w:name="_Toc118823098"/>
+            <w:bookmarkStart w:id="70" w:name="_Toc118879555"/>
             <w:r>
               <w:rPr>
                 <w:color w:val="000000" w:themeColor="text1"/>
@@ -18558,8 +19544,20 @@
                 <w:color w:val="FFFFFF"/>
                 <w:u w:color="FFFFFF"/>
               </w:rPr>
-              <w:t>Entry Condition</w:t>
-            </w:r>
+              <w:t xml:space="preserve">Entry </w:t>
+            </w:r>
+            <w:proofErr w:type="spellStart"/>
+            <w:r>
+              <w:rPr>
+                <w:rFonts w:ascii="Cambria" w:hAnsi="Cambria"/>
+                <w:b/>
+                <w:bCs/>
+                <w:color w:val="FFFFFF"/>
+                <w:u w:color="FFFFFF"/>
+              </w:rPr>
+              <w:t>Condition</w:t>
+            </w:r>
+            <w:proofErr w:type="spellEnd"/>
           </w:p>
         </w:tc>
         <w:tc>
@@ -19003,7 +20001,25 @@
                 <w:sz w:val="22"/>
                 <w:szCs w:val="22"/>
               </w:rPr>
-              <w:t>Il sistema restituisce un form di ricerca dell’articolo.</w:t>
+              <w:t xml:space="preserve">Il sistema restituisce un </w:t>
+            </w:r>
+            <w:proofErr w:type="spellStart"/>
+            <w:r>
+              <w:rPr>
+                <w:rFonts w:ascii="Calibri Light" w:hAnsi="Calibri Light"/>
+                <w:sz w:val="22"/>
+                <w:szCs w:val="22"/>
+              </w:rPr>
+              <w:t>form</w:t>
+            </w:r>
+            <w:proofErr w:type="spellEnd"/>
+            <w:r>
+              <w:rPr>
+                <w:rFonts w:ascii="Calibri Light" w:hAnsi="Calibri Light"/>
+                <w:sz w:val="22"/>
+                <w:szCs w:val="22"/>
+              </w:rPr>
+              <w:t xml:space="preserve"> di ricerca dell’articolo.</w:t>
             </w:r>
           </w:p>
           <w:p>
@@ -19147,7 +20163,25 @@
                 <w:sz w:val="22"/>
                 <w:szCs w:val="22"/>
               </w:rPr>
-              <w:t>“Path” dell’immagine</w:t>
+              <w:t>“</w:t>
+            </w:r>
+            <w:proofErr w:type="spellStart"/>
+            <w:r>
+              <w:rPr>
+                <w:rFonts w:ascii="Calibri Light" w:hAnsi="Calibri Light"/>
+                <w:sz w:val="22"/>
+                <w:szCs w:val="22"/>
+              </w:rPr>
+              <w:t>Path</w:t>
+            </w:r>
+            <w:proofErr w:type="spellEnd"/>
+            <w:r>
+              <w:rPr>
+                <w:rFonts w:ascii="Calibri Light" w:hAnsi="Calibri Light"/>
+                <w:sz w:val="22"/>
+                <w:szCs w:val="22"/>
+              </w:rPr>
+              <w:t>” dell’immagine</w:t>
             </w:r>
           </w:p>
           <w:p>
@@ -19234,7 +20268,29 @@
                 <w:color w:val="FFFFFF"/>
                 <w:u w:color="FFFFFF"/>
               </w:rPr>
-              <w:t>Exit Condition On Success</w:t>
+              <w:t xml:space="preserve">Exit </w:t>
+            </w:r>
+            <w:proofErr w:type="spellStart"/>
+            <w:r>
+              <w:rPr>
+                <w:rFonts w:ascii="Cambria" w:hAnsi="Cambria"/>
+                <w:b/>
+                <w:bCs/>
+                <w:color w:val="FFFFFF"/>
+                <w:u w:color="FFFFFF"/>
+              </w:rPr>
+              <w:t>Condition</w:t>
+            </w:r>
+            <w:proofErr w:type="spellEnd"/>
+            <w:r>
+              <w:rPr>
+                <w:rFonts w:ascii="Cambria" w:hAnsi="Cambria"/>
+                <w:b/>
+                <w:bCs/>
+                <w:color w:val="FFFFFF"/>
+                <w:u w:color="FFFFFF"/>
+              </w:rPr>
+              <w:t xml:space="preserve"> On Success</w:t>
             </w:r>
           </w:p>
         </w:tc>
@@ -19398,8 +20454,20 @@
                 <w:color w:val="FFFFFF"/>
                 <w:u w:color="FFFFFF"/>
               </w:rPr>
-              <w:t>User Priority</w:t>
-            </w:r>
+              <w:t xml:space="preserve">User </w:t>
+            </w:r>
+            <w:proofErr w:type="spellStart"/>
+            <w:r>
+              <w:rPr>
+                <w:rFonts w:ascii="Cambria" w:hAnsi="Cambria"/>
+                <w:b/>
+                <w:bCs/>
+                <w:color w:val="FFFFFF"/>
+                <w:u w:color="FFFFFF"/>
+              </w:rPr>
+              <w:t>Priority</w:t>
+            </w:r>
+            <w:proofErr w:type="spellEnd"/>
           </w:p>
         </w:tc>
         <w:tc>
@@ -19459,7 +20527,7 @@
           <w:szCs w:val="32"/>
         </w:rPr>
       </w:pPr>
-      <w:bookmarkStart w:id="71" w:name="_Toc118823099"/>
+      <w:bookmarkStart w:id="71" w:name="_Toc118879556"/>
       <w:r>
         <w:rPr>
           <w:rFonts w:ascii="Times New Roman" w:hAnsi="Times New Roman" w:cs="Times New Roman"/>
@@ -19645,7 +20713,7 @@
           <w:szCs w:val="32"/>
         </w:rPr>
       </w:pPr>
-      <w:bookmarkStart w:id="72" w:name="_Toc118823100"/>
+      <w:bookmarkStart w:id="72" w:name="_Toc118879557"/>
       <w:r>
         <w:rPr>
           <w:rFonts w:ascii="Times New Roman" w:hAnsi="Times New Roman" w:cs="Times New Roman"/>
@@ -19758,7 +20826,7 @@
         </w:rPr>
       </w:pPr>
       <w:bookmarkStart w:id="73" w:name="_Toc117977253"/>
-      <w:bookmarkStart w:id="74" w:name="_Toc118823101"/>
+      <w:bookmarkStart w:id="74" w:name="_Toc118879558"/>
       <w:r>
         <w:rPr>
           <w:rFonts w:ascii="Times New Roman" w:hAnsi="Times New Roman" w:cs="Times New Roman"/>
@@ -19948,7 +21016,7 @@
               </w:rPr>
             </w:pPr>
             <w:bookmarkStart w:id="75" w:name="_Toc117977254"/>
-            <w:bookmarkStart w:id="76" w:name="_Toc118823102"/>
+            <w:bookmarkStart w:id="76" w:name="_Toc118879559"/>
             <w:r>
               <w:rPr>
                 <w:color w:val="000000" w:themeColor="text1"/>
@@ -20147,8 +21215,20 @@
                 <w:color w:val="FFFFFF"/>
                 <w:u w:color="FFFFFF"/>
               </w:rPr>
-              <w:t>Entry Condition</w:t>
-            </w:r>
+              <w:t xml:space="preserve">Entry </w:t>
+            </w:r>
+            <w:proofErr w:type="spellStart"/>
+            <w:r>
+              <w:rPr>
+                <w:rFonts w:ascii="Cambria" w:hAnsi="Cambria"/>
+                <w:b/>
+                <w:bCs/>
+                <w:color w:val="FFFFFF"/>
+                <w:u w:color="FFFFFF"/>
+              </w:rPr>
+              <w:t>Condition</w:t>
+            </w:r>
+            <w:proofErr w:type="spellEnd"/>
           </w:p>
         </w:tc>
         <w:tc>
@@ -20616,7 +21696,25 @@
                 <w:sz w:val="22"/>
                 <w:szCs w:val="22"/>
               </w:rPr>
-              <w:t>Il sistema restituisce un form con i campi da compilare (codice, nome, descrizione, immagine e prezzo).</w:t>
+              <w:t xml:space="preserve">Il sistema restituisce un </w:t>
+            </w:r>
+            <w:proofErr w:type="spellStart"/>
+            <w:r>
+              <w:rPr>
+                <w:rFonts w:ascii="Calibri Light" w:hAnsi="Calibri Light"/>
+                <w:sz w:val="22"/>
+                <w:szCs w:val="22"/>
+              </w:rPr>
+              <w:t>form</w:t>
+            </w:r>
+            <w:proofErr w:type="spellEnd"/>
+            <w:r>
+              <w:rPr>
+                <w:rFonts w:ascii="Calibri Light" w:hAnsi="Calibri Light"/>
+                <w:sz w:val="22"/>
+                <w:szCs w:val="22"/>
+              </w:rPr>
+              <w:t xml:space="preserve"> con i campi da compilare (codice, nome, descrizione, immagine e prezzo).</w:t>
             </w:r>
           </w:p>
           <w:p>
@@ -20756,7 +21854,25 @@
                 <w:sz w:val="22"/>
                 <w:szCs w:val="22"/>
               </w:rPr>
-              <w:t>“Path” dell’immagine</w:t>
+              <w:t>“</w:t>
+            </w:r>
+            <w:proofErr w:type="spellStart"/>
+            <w:r>
+              <w:rPr>
+                <w:rFonts w:ascii="Calibri Light" w:hAnsi="Calibri Light"/>
+                <w:sz w:val="22"/>
+                <w:szCs w:val="22"/>
+              </w:rPr>
+              <w:t>Path</w:t>
+            </w:r>
+            <w:proofErr w:type="spellEnd"/>
+            <w:r>
+              <w:rPr>
+                <w:rFonts w:ascii="Calibri Light" w:hAnsi="Calibri Light"/>
+                <w:sz w:val="22"/>
+                <w:szCs w:val="22"/>
+              </w:rPr>
+              <w:t>” dell’immagine</w:t>
             </w:r>
           </w:p>
           <w:p>
@@ -20835,7 +21951,29 @@
                 <w:color w:val="FFFFFF"/>
                 <w:u w:color="FFFFFF"/>
               </w:rPr>
-              <w:t>Exit Condition On Success</w:t>
+              <w:t xml:space="preserve">Exit </w:t>
+            </w:r>
+            <w:proofErr w:type="spellStart"/>
+            <w:r>
+              <w:rPr>
+                <w:rFonts w:ascii="Cambria" w:hAnsi="Cambria"/>
+                <w:b/>
+                <w:bCs/>
+                <w:color w:val="FFFFFF"/>
+                <w:u w:color="FFFFFF"/>
+              </w:rPr>
+              <w:t>Condition</w:t>
+            </w:r>
+            <w:proofErr w:type="spellEnd"/>
+            <w:r>
+              <w:rPr>
+                <w:rFonts w:ascii="Cambria" w:hAnsi="Cambria"/>
+                <w:b/>
+                <w:bCs/>
+                <w:color w:val="FFFFFF"/>
+                <w:u w:color="FFFFFF"/>
+              </w:rPr>
+              <w:t xml:space="preserve"> On Success</w:t>
             </w:r>
           </w:p>
         </w:tc>
@@ -20983,8 +22121,20 @@
                 <w:color w:val="FFFFFF"/>
                 <w:u w:color="FFFFFF"/>
               </w:rPr>
-              <w:t>User Priority</w:t>
-            </w:r>
+              <w:t xml:space="preserve">User </w:t>
+            </w:r>
+            <w:proofErr w:type="spellStart"/>
+            <w:r>
+              <w:rPr>
+                <w:rFonts w:ascii="Cambria" w:hAnsi="Cambria"/>
+                <w:b/>
+                <w:bCs/>
+                <w:color w:val="FFFFFF"/>
+                <w:u w:color="FFFFFF"/>
+              </w:rPr>
+              <w:t>Priority</w:t>
+            </w:r>
+            <w:proofErr w:type="spellEnd"/>
           </w:p>
         </w:tc>
         <w:tc>
@@ -21035,7 +22185,7 @@
           <w:szCs w:val="32"/>
         </w:rPr>
       </w:pPr>
-      <w:bookmarkStart w:id="77" w:name="_Toc118823103"/>
+      <w:bookmarkStart w:id="77" w:name="_Toc118879560"/>
       <w:r>
         <w:rPr>
           <w:rFonts w:ascii="Times New Roman" w:hAnsi="Times New Roman" w:cs="Times New Roman"/>
@@ -21184,7 +22334,7 @@
           <w:szCs w:val="32"/>
         </w:rPr>
       </w:pPr>
-      <w:bookmarkStart w:id="78" w:name="_Toc118823104"/>
+      <w:bookmarkStart w:id="78" w:name="_Toc118879561"/>
       <w:r>
         <w:rPr>
           <w:rFonts w:ascii="Times New Roman" w:hAnsi="Times New Roman" w:cs="Times New Roman"/>
@@ -21277,13 +22427,473 @@
     </w:p>
     <w:p>
       <w:pPr>
+        <w:pStyle w:val="Titolo1"/>
+        <w:rPr>
+          <w:rFonts w:ascii="Times New Roman" w:hAnsi="Times New Roman" w:cs="Times New Roman"/>
+          <w:b/>
+          <w:bCs/>
+          <w:color w:val="auto"/>
+        </w:rPr>
+      </w:pPr>
+    </w:p>
+    <w:p>
+      <w:pPr>
+        <w:pStyle w:val="Titolo1"/>
+        <w:rPr>
+          <w:rFonts w:ascii="Times New Roman" w:hAnsi="Times New Roman" w:cs="Times New Roman"/>
+          <w:b/>
+          <w:bCs/>
+          <w:color w:val="auto"/>
+        </w:rPr>
+      </w:pPr>
+      <w:bookmarkStart w:id="79" w:name="_Hlk118879245"/>
+      <w:bookmarkStart w:id="80" w:name="_Toc118879562"/>
+      <w:r>
+        <w:rPr>
+          <w:rFonts w:ascii="Times New Roman" w:hAnsi="Times New Roman" w:cs="Times New Roman"/>
+          <w:b/>
+          <w:bCs/>
+          <w:color w:val="auto"/>
+        </w:rPr>
+        <w:t xml:space="preserve">Class </w:t>
+      </w:r>
+      <w:proofErr w:type="spellStart"/>
+      <w:r>
+        <w:rPr>
+          <w:rFonts w:ascii="Times New Roman" w:hAnsi="Times New Roman" w:cs="Times New Roman"/>
+          <w:b/>
+          <w:bCs/>
+          <w:color w:val="auto"/>
+        </w:rPr>
+        <w:t>Diagram</w:t>
+      </w:r>
+      <w:bookmarkEnd w:id="80"/>
+      <w:proofErr w:type="spellEnd"/>
+    </w:p>
+    <w:bookmarkEnd w:id="79"/>
+    <w:p/>
+    <w:p>
+      <w:pPr>
         <w:rPr>
           <w:u w:val="single"/>
+        </w:rPr>
+      </w:pPr>
+      <w:r>
+        <w:rPr>
+          <w:noProof/>
+          <w:u w:val="single"/>
+        </w:rPr>
+        <w:drawing>
+          <wp:inline distT="0" distB="0" distL="0" distR="0" wp14:anchorId="107E31B3" wp14:editId="69C38176">
+            <wp:extent cx="6113780" cy="3881755"/>
+            <wp:effectExtent l="0" t="0" r="0" b="0"/>
+            <wp:docPr id="31" name="Immagine 31"/>
+            <wp:cNvGraphicFramePr>
+              <a:graphicFrameLocks xmlns:a="http://schemas.openxmlformats.org/drawingml/2006/main" noChangeAspect="1"/>
+            </wp:cNvGraphicFramePr>
+            <a:graphic xmlns:a="http://schemas.openxmlformats.org/drawingml/2006/main">
+              <a:graphicData uri="http://schemas.openxmlformats.org/drawingml/2006/picture">
+                <pic:pic xmlns:pic="http://schemas.openxmlformats.org/drawingml/2006/picture">
+                  <pic:nvPicPr>
+                    <pic:cNvPr id="0" name="Picture 2"/>
+                    <pic:cNvPicPr>
+                      <a:picLocks noChangeAspect="1" noChangeArrowheads="1"/>
+                    </pic:cNvPicPr>
+                  </pic:nvPicPr>
+                  <pic:blipFill>
+                    <a:blip r:embed="rId43">
+                      <a:extLst>
+                        <a:ext uri="{28A0092B-C50C-407E-A947-70E740481C1C}">
+                          <a14:useLocalDpi xmlns:a14="http://schemas.microsoft.com/office/drawing/2010/main" val="0"/>
+                        </a:ext>
+                      </a:extLst>
+                    </a:blip>
+                    <a:srcRect/>
+                    <a:stretch>
+                      <a:fillRect/>
+                    </a:stretch>
+                  </pic:blipFill>
+                  <pic:spPr bwMode="auto">
+                    <a:xfrm>
+                      <a:off x="0" y="0"/>
+                      <a:ext cx="6113780" cy="3881755"/>
+                    </a:xfrm>
+                    <a:prstGeom prst="rect">
+                      <a:avLst/>
+                    </a:prstGeom>
+                    <a:noFill/>
+                    <a:ln>
+                      <a:noFill/>
+                    </a:ln>
+                  </pic:spPr>
+                </pic:pic>
+              </a:graphicData>
+            </a:graphic>
+          </wp:inline>
+        </w:drawing>
+      </w:r>
+    </w:p>
+    <w:p>
+      <w:pPr>
+        <w:rPr>
+          <w:u w:val="single"/>
+        </w:rPr>
+      </w:pPr>
+    </w:p>
+    <w:p>
+      <w:pPr>
+        <w:pStyle w:val="Titolo1"/>
+        <w:rPr>
+          <w:rFonts w:ascii="Times New Roman" w:hAnsi="Times New Roman" w:cs="Times New Roman"/>
+          <w:b/>
+          <w:bCs/>
+          <w:color w:val="auto"/>
+        </w:rPr>
+      </w:pPr>
+    </w:p>
+    <w:p/>
+    <w:p>
+      <w:pPr>
+        <w:pStyle w:val="Titolo1"/>
+        <w:rPr>
+          <w:rFonts w:ascii="Times New Roman" w:hAnsi="Times New Roman" w:cs="Times New Roman"/>
+          <w:b/>
+          <w:bCs/>
+          <w:color w:val="auto"/>
+        </w:rPr>
+      </w:pPr>
+      <w:bookmarkStart w:id="81" w:name="_Toc118879563"/>
+      <w:proofErr w:type="spellStart"/>
+      <w:r>
+        <w:rPr>
+          <w:rFonts w:ascii="Times New Roman" w:hAnsi="Times New Roman" w:cs="Times New Roman"/>
+          <w:b/>
+          <w:bCs/>
+          <w:color w:val="auto"/>
+        </w:rPr>
+        <w:lastRenderedPageBreak/>
+        <w:t>Mockup</w:t>
+      </w:r>
+      <w:bookmarkEnd w:id="81"/>
+      <w:proofErr w:type="spellEnd"/>
+    </w:p>
+    <w:p>
+      <w:pPr>
+        <w:jc w:val="center"/>
+        <w:rPr>
+          <w:b/>
+          <w:bCs/>
+          <w:sz w:val="28"/>
+          <w:szCs w:val="28"/>
+        </w:rPr>
+      </w:pPr>
+      <w:r>
+        <w:rPr>
+          <w:b/>
+          <w:bCs/>
+          <w:sz w:val="28"/>
+          <w:szCs w:val="28"/>
+        </w:rPr>
+        <w:t>Login</w:t>
+      </w:r>
+    </w:p>
+    <w:p>
+      <w:pPr>
+        <w:jc w:val="center"/>
+        <w:rPr>
+          <w:b/>
+          <w:bCs/>
+          <w:sz w:val="28"/>
+          <w:szCs w:val="28"/>
+        </w:rPr>
+      </w:pPr>
+      <w:r>
+        <w:rPr>
+          <w:b/>
+          <w:bCs/>
+          <w:noProof/>
+          <w:sz w:val="28"/>
+          <w:szCs w:val="28"/>
+        </w:rPr>
+        <w:drawing>
+          <wp:inline distT="0" distB="0" distL="0" distR="0" wp14:anchorId="0F33229D" wp14:editId="71246361">
+            <wp:extent cx="5446509" cy="3870960"/>
+            <wp:effectExtent l="76200" t="76200" r="116205" b="110490"/>
+            <wp:docPr id="28" name="Immagine 28"/>
+            <wp:cNvGraphicFramePr>
+              <a:graphicFrameLocks xmlns:a="http://schemas.openxmlformats.org/drawingml/2006/main" noChangeAspect="1"/>
+            </wp:cNvGraphicFramePr>
+            <a:graphic xmlns:a="http://schemas.openxmlformats.org/drawingml/2006/main">
+              <a:graphicData uri="http://schemas.openxmlformats.org/drawingml/2006/picture">
+                <pic:pic xmlns:pic="http://schemas.openxmlformats.org/drawingml/2006/picture">
+                  <pic:nvPicPr>
+                    <pic:cNvPr id="0" name="Picture 1"/>
+                    <pic:cNvPicPr>
+                      <a:picLocks noChangeAspect="1" noChangeArrowheads="1"/>
+                    </pic:cNvPicPr>
+                  </pic:nvPicPr>
+                  <pic:blipFill>
+                    <a:blip r:embed="rId44" cstate="print">
+                      <a:extLst>
+                        <a:ext uri="{28A0092B-C50C-407E-A947-70E740481C1C}">
+                          <a14:useLocalDpi xmlns:a14="http://schemas.microsoft.com/office/drawing/2010/main" val="0"/>
+                        </a:ext>
+                      </a:extLst>
+                    </a:blip>
+                    <a:srcRect/>
+                    <a:stretch>
+                      <a:fillRect/>
+                    </a:stretch>
+                  </pic:blipFill>
+                  <pic:spPr bwMode="auto">
+                    <a:xfrm>
+                      <a:off x="0" y="0"/>
+                      <a:ext cx="5453063" cy="3875618"/>
+                    </a:xfrm>
+                    <a:prstGeom prst="rect">
+                      <a:avLst/>
+                    </a:prstGeom>
+                    <a:ln w="38100" cap="sq">
+                      <a:solidFill>
+                        <a:srgbClr val="000000"/>
+                      </a:solidFill>
+                      <a:prstDash val="solid"/>
+                      <a:miter lim="800000"/>
+                    </a:ln>
+                    <a:effectLst>
+                      <a:outerShdw blurRad="50800" dist="38100" dir="2700000" algn="tl" rotWithShape="0">
+                        <a:srgbClr val="000000">
+                          <a:alpha val="43000"/>
+                        </a:srgbClr>
+                      </a:outerShdw>
+                    </a:effectLst>
+                  </pic:spPr>
+                </pic:pic>
+              </a:graphicData>
+            </a:graphic>
+          </wp:inline>
+        </w:drawing>
+      </w:r>
+    </w:p>
+    <w:p>
+      <w:pPr>
+        <w:rPr>
+          <w:b/>
+          <w:bCs/>
+          <w:sz w:val="28"/>
+          <w:szCs w:val="28"/>
+        </w:rPr>
+      </w:pPr>
+    </w:p>
+    <w:p>
+      <w:pPr>
+        <w:jc w:val="center"/>
+        <w:rPr>
+          <w:b/>
+          <w:bCs/>
+          <w:sz w:val="28"/>
+          <w:szCs w:val="28"/>
+        </w:rPr>
+      </w:pPr>
+      <w:r>
+        <w:rPr>
+          <w:b/>
+          <w:bCs/>
+          <w:sz w:val="28"/>
+          <w:szCs w:val="28"/>
+        </w:rPr>
+        <w:t>Home</w:t>
+      </w:r>
+    </w:p>
+    <w:p>
+      <w:pPr>
+        <w:jc w:val="center"/>
+        <w:rPr>
+          <w:b/>
+          <w:bCs/>
+          <w:sz w:val="28"/>
+          <w:szCs w:val="28"/>
+        </w:rPr>
+      </w:pPr>
+      <w:r>
+        <w:rPr>
+          <w:b/>
+          <w:bCs/>
+          <w:noProof/>
+          <w:sz w:val="28"/>
+          <w:szCs w:val="28"/>
+        </w:rPr>
+        <w:drawing>
+          <wp:inline distT="0" distB="0" distL="0" distR="0" wp14:anchorId="3290EEE4" wp14:editId="2DCD2252">
+            <wp:extent cx="5440680" cy="3866818"/>
+            <wp:effectExtent l="76200" t="76200" r="121920" b="114935"/>
+            <wp:docPr id="32" name="Immagine 32"/>
+            <wp:cNvGraphicFramePr>
+              <a:graphicFrameLocks xmlns:a="http://schemas.openxmlformats.org/drawingml/2006/main" noChangeAspect="1"/>
+            </wp:cNvGraphicFramePr>
+            <a:graphic xmlns:a="http://schemas.openxmlformats.org/drawingml/2006/main">
+              <a:graphicData uri="http://schemas.openxmlformats.org/drawingml/2006/picture">
+                <pic:pic xmlns:pic="http://schemas.openxmlformats.org/drawingml/2006/picture">
+                  <pic:nvPicPr>
+                    <pic:cNvPr id="0" name="Picture 2"/>
+                    <pic:cNvPicPr>
+                      <a:picLocks noChangeAspect="1" noChangeArrowheads="1"/>
+                    </pic:cNvPicPr>
+                  </pic:nvPicPr>
+                  <pic:blipFill>
+                    <a:blip r:embed="rId45" cstate="print">
+                      <a:extLst>
+                        <a:ext uri="{28A0092B-C50C-407E-A947-70E740481C1C}">
+                          <a14:useLocalDpi xmlns:a14="http://schemas.microsoft.com/office/drawing/2010/main" val="0"/>
+                        </a:ext>
+                      </a:extLst>
+                    </a:blip>
+                    <a:srcRect/>
+                    <a:stretch>
+                      <a:fillRect/>
+                    </a:stretch>
+                  </pic:blipFill>
+                  <pic:spPr bwMode="auto">
+                    <a:xfrm>
+                      <a:off x="0" y="0"/>
+                      <a:ext cx="5447196" cy="3871449"/>
+                    </a:xfrm>
+                    <a:prstGeom prst="rect">
+                      <a:avLst/>
+                    </a:prstGeom>
+                    <a:ln w="38100" cap="sq">
+                      <a:solidFill>
+                        <a:srgbClr val="000000"/>
+                      </a:solidFill>
+                      <a:prstDash val="solid"/>
+                      <a:miter lim="800000"/>
+                    </a:ln>
+                    <a:effectLst>
+                      <a:outerShdw blurRad="50800" dist="38100" dir="2700000" algn="tl" rotWithShape="0">
+                        <a:srgbClr val="000000">
+                          <a:alpha val="43000"/>
+                        </a:srgbClr>
+                      </a:outerShdw>
+                    </a:effectLst>
+                  </pic:spPr>
+                </pic:pic>
+              </a:graphicData>
+            </a:graphic>
+          </wp:inline>
+        </w:drawing>
+      </w:r>
+    </w:p>
+    <w:p>
+      <w:pPr>
+        <w:jc w:val="center"/>
+        <w:rPr>
+          <w:b/>
+          <w:bCs/>
+          <w:sz w:val="28"/>
+          <w:szCs w:val="28"/>
+        </w:rPr>
+      </w:pPr>
+    </w:p>
+    <w:p>
+      <w:pPr>
+        <w:jc w:val="center"/>
+        <w:rPr>
+          <w:b/>
+          <w:bCs/>
+          <w:sz w:val="28"/>
+          <w:szCs w:val="28"/>
+        </w:rPr>
+      </w:pPr>
+      <w:r>
+        <w:rPr>
+          <w:b/>
+          <w:bCs/>
+          <w:sz w:val="28"/>
+          <w:szCs w:val="28"/>
+        </w:rPr>
+        <w:t>Ricerca</w:t>
+      </w:r>
+      <w:r>
+        <w:rPr>
+          <w:b/>
+          <w:bCs/>
+          <w:noProof/>
+          <w:sz w:val="28"/>
+          <w:szCs w:val="28"/>
+        </w:rPr>
+        <w:drawing>
+          <wp:inline distT="0" distB="0" distL="0" distR="0" wp14:anchorId="5595E151" wp14:editId="5ABAA857">
+            <wp:extent cx="6111240" cy="4343400"/>
+            <wp:effectExtent l="76200" t="76200" r="118110" b="114300"/>
+            <wp:docPr id="33" name="Immagine 33"/>
+            <wp:cNvGraphicFramePr>
+              <a:graphicFrameLocks xmlns:a="http://schemas.openxmlformats.org/drawingml/2006/main" noChangeAspect="1"/>
+            </wp:cNvGraphicFramePr>
+            <a:graphic xmlns:a="http://schemas.openxmlformats.org/drawingml/2006/main">
+              <a:graphicData uri="http://schemas.openxmlformats.org/drawingml/2006/picture">
+                <pic:pic xmlns:pic="http://schemas.openxmlformats.org/drawingml/2006/picture">
+                  <pic:nvPicPr>
+                    <pic:cNvPr id="0" name="Picture 3"/>
+                    <pic:cNvPicPr>
+                      <a:picLocks noChangeAspect="1" noChangeArrowheads="1"/>
+                    </pic:cNvPicPr>
+                  </pic:nvPicPr>
+                  <pic:blipFill>
+                    <a:blip r:embed="rId46">
+                      <a:extLst>
+                        <a:ext uri="{28A0092B-C50C-407E-A947-70E740481C1C}">
+                          <a14:useLocalDpi xmlns:a14="http://schemas.microsoft.com/office/drawing/2010/main" val="0"/>
+                        </a:ext>
+                      </a:extLst>
+                    </a:blip>
+                    <a:srcRect/>
+                    <a:stretch>
+                      <a:fillRect/>
+                    </a:stretch>
+                  </pic:blipFill>
+                  <pic:spPr bwMode="auto">
+                    <a:xfrm>
+                      <a:off x="0" y="0"/>
+                      <a:ext cx="6111240" cy="4343400"/>
+                    </a:xfrm>
+                    <a:prstGeom prst="rect">
+                      <a:avLst/>
+                    </a:prstGeom>
+                    <a:ln w="38100" cap="sq">
+                      <a:solidFill>
+                        <a:srgbClr val="000000"/>
+                      </a:solidFill>
+                      <a:prstDash val="solid"/>
+                      <a:miter lim="800000"/>
+                    </a:ln>
+                    <a:effectLst>
+                      <a:outerShdw blurRad="50800" dist="38100" dir="2700000" algn="tl" rotWithShape="0">
+                        <a:srgbClr val="000000">
+                          <a:alpha val="43000"/>
+                        </a:srgbClr>
+                      </a:outerShdw>
+                    </a:effectLst>
+                  </pic:spPr>
+                </pic:pic>
+              </a:graphicData>
+            </a:graphic>
+          </wp:inline>
+        </w:drawing>
+      </w:r>
+    </w:p>
+    <w:p>
+      <w:pPr>
+        <w:jc w:val="center"/>
+        <w:rPr>
+          <w:b/>
+          <w:bCs/>
+          <w:sz w:val="28"/>
+          <w:szCs w:val="28"/>
         </w:rPr>
       </w:pPr>
     </w:p>
     <w:sectPr>
-      <w:footerReference w:type="default" r:id="rId43"/>
+      <w:footerReference w:type="default" r:id="rId47"/>
       <w:pgSz w:w="11906" w:h="16838"/>
       <w:pgMar w:top="1417" w:right="1134" w:bottom="1134" w:left="1134" w:header="708" w:footer="708" w:gutter="0"/>
       <w:cols w:space="708"/>
@@ -23170,6 +24780,92 @@
     </w:lvl>
   </w:abstractNum>
   <w:abstractNum w:abstractNumId="14" w15:restartNumberingAfterBreak="0">
+    <w:nsid w:val="577D178E"/>
+    <w:multiLevelType w:val="hybridMultilevel"/>
+    <w:tmpl w:val="F13AFEF4"/>
+    <w:lvl w:ilvl="0" w:tplc="0410000F">
+      <w:start w:val="1"/>
+      <w:numFmt w:val="decimal"/>
+      <w:lvlText w:val="%1."/>
+      <w:lvlJc w:val="left"/>
+      <w:pPr>
+        <w:ind w:left="360" w:hanging="360"/>
+      </w:pPr>
+    </w:lvl>
+    <w:lvl w:ilvl="1" w:tplc="04100019" w:tentative="1">
+      <w:start w:val="1"/>
+      <w:numFmt w:val="lowerLetter"/>
+      <w:lvlText w:val="%2."/>
+      <w:lvlJc w:val="left"/>
+      <w:pPr>
+        <w:ind w:left="1080" w:hanging="360"/>
+      </w:pPr>
+    </w:lvl>
+    <w:lvl w:ilvl="2" w:tplc="0410001B" w:tentative="1">
+      <w:start w:val="1"/>
+      <w:numFmt w:val="lowerRoman"/>
+      <w:lvlText w:val="%3."/>
+      <w:lvlJc w:val="right"/>
+      <w:pPr>
+        <w:ind w:left="1800" w:hanging="180"/>
+      </w:pPr>
+    </w:lvl>
+    <w:lvl w:ilvl="3" w:tplc="0410000F" w:tentative="1">
+      <w:start w:val="1"/>
+      <w:numFmt w:val="decimal"/>
+      <w:lvlText w:val="%4."/>
+      <w:lvlJc w:val="left"/>
+      <w:pPr>
+        <w:ind w:left="2520" w:hanging="360"/>
+      </w:pPr>
+    </w:lvl>
+    <w:lvl w:ilvl="4" w:tplc="04100019" w:tentative="1">
+      <w:start w:val="1"/>
+      <w:numFmt w:val="lowerLetter"/>
+      <w:lvlText w:val="%5."/>
+      <w:lvlJc w:val="left"/>
+      <w:pPr>
+        <w:ind w:left="3240" w:hanging="360"/>
+      </w:pPr>
+    </w:lvl>
+    <w:lvl w:ilvl="5" w:tplc="0410001B" w:tentative="1">
+      <w:start w:val="1"/>
+      <w:numFmt w:val="lowerRoman"/>
+      <w:lvlText w:val="%6."/>
+      <w:lvlJc w:val="right"/>
+      <w:pPr>
+        <w:ind w:left="3960" w:hanging="180"/>
+      </w:pPr>
+    </w:lvl>
+    <w:lvl w:ilvl="6" w:tplc="0410000F" w:tentative="1">
+      <w:start w:val="1"/>
+      <w:numFmt w:val="decimal"/>
+      <w:lvlText w:val="%7."/>
+      <w:lvlJc w:val="left"/>
+      <w:pPr>
+        <w:ind w:left="4680" w:hanging="360"/>
+      </w:pPr>
+    </w:lvl>
+    <w:lvl w:ilvl="7" w:tplc="04100019" w:tentative="1">
+      <w:start w:val="1"/>
+      <w:numFmt w:val="lowerLetter"/>
+      <w:lvlText w:val="%8."/>
+      <w:lvlJc w:val="left"/>
+      <w:pPr>
+        <w:ind w:left="5400" w:hanging="360"/>
+      </w:pPr>
+    </w:lvl>
+    <w:lvl w:ilvl="8" w:tplc="0410001B" w:tentative="1">
+      <w:start w:val="1"/>
+      <w:numFmt w:val="lowerRoman"/>
+      <w:lvlText w:val="%9."/>
+      <w:lvlJc w:val="right"/>
+      <w:pPr>
+        <w:ind w:left="6120" w:hanging="180"/>
+      </w:pPr>
+    </w:lvl>
+  </w:abstractNum>
+  <w:abstractNum w:abstractNumId="15" w15:restartNumberingAfterBreak="0">
     <w:nsid w:val="5A095CBC"/>
     <w:multiLevelType w:val="hybridMultilevel"/>
     <w:tmpl w:val="D7D225B2"/>
@@ -23462,7 +25158,7 @@
       </w:rPr>
     </w:lvl>
   </w:abstractNum>
-  <w:abstractNum w:abstractNumId="15" w15:restartNumberingAfterBreak="0">
+  <w:abstractNum w:abstractNumId="16" w15:restartNumberingAfterBreak="0">
     <w:nsid w:val="5A4019BC"/>
     <w:multiLevelType w:val="hybridMultilevel"/>
     <w:tmpl w:val="DEB2DE88"/>
@@ -23755,7 +25451,7 @@
       </w:rPr>
     </w:lvl>
   </w:abstractNum>
-  <w:abstractNum w:abstractNumId="16" w15:restartNumberingAfterBreak="0">
+  <w:abstractNum w:abstractNumId="17" w15:restartNumberingAfterBreak="0">
     <w:nsid w:val="65CD481B"/>
     <w:multiLevelType w:val="multilevel"/>
     <w:tmpl w:val="0A4C5696"/>
@@ -23868,7 +25564,7 @@
       </w:rPr>
     </w:lvl>
   </w:abstractNum>
-  <w:abstractNum w:abstractNumId="17" w15:restartNumberingAfterBreak="0">
+  <w:abstractNum w:abstractNumId="18" w15:restartNumberingAfterBreak="0">
     <w:nsid w:val="701117E9"/>
     <w:multiLevelType w:val="hybridMultilevel"/>
     <w:tmpl w:val="03CE47C2"/>
@@ -23957,7 +25653,7 @@
       </w:pPr>
     </w:lvl>
   </w:abstractNum>
-  <w:abstractNum w:abstractNumId="18" w15:restartNumberingAfterBreak="0">
+  <w:abstractNum w:abstractNumId="19" w15:restartNumberingAfterBreak="0">
     <w:nsid w:val="7D32439B"/>
     <w:multiLevelType w:val="hybridMultilevel"/>
     <w:tmpl w:val="B330B4D6"/>
@@ -24092,7 +25788,7 @@
     <w:abstractNumId w:val="8"/>
   </w:num>
   <w:num w:numId="8" w16cid:durableId="1657370237">
-    <w:abstractNumId w:val="17"/>
+    <w:abstractNumId w:val="18"/>
   </w:num>
   <w:num w:numId="9" w16cid:durableId="1756315909">
     <w:abstractNumId w:val="7"/>
@@ -24107,13 +25803,13 @@
     <w:abstractNumId w:val="3"/>
   </w:num>
   <w:num w:numId="13" w16cid:durableId="440492454">
-    <w:abstractNumId w:val="14"/>
+    <w:abstractNumId w:val="15"/>
   </w:num>
   <w:num w:numId="14" w16cid:durableId="1753045637">
-    <w:abstractNumId w:val="15"/>
+    <w:abstractNumId w:val="16"/>
   </w:num>
   <w:num w:numId="15" w16cid:durableId="1765952051">
-    <w:abstractNumId w:val="18"/>
+    <w:abstractNumId w:val="19"/>
   </w:num>
   <w:num w:numId="16" w16cid:durableId="1104961619">
     <w:abstractNumId w:val="0"/>
@@ -24122,10 +25818,13 @@
     <w:abstractNumId w:val="10"/>
   </w:num>
   <w:num w:numId="18" w16cid:durableId="417293943">
-    <w:abstractNumId w:val="16"/>
+    <w:abstractNumId w:val="17"/>
   </w:num>
   <w:num w:numId="19" w16cid:durableId="824400715">
     <w:abstractNumId w:val="6"/>
+  </w:num>
+  <w:num w:numId="20" w16cid:durableId="279730333">
+    <w:abstractNumId w:val="14"/>
   </w:num>
 </w:numbering>
 </file>

</xml_diff>